<commit_message>
Editing tables to separate Katie and Francis data.
</commit_message>
<xml_diff>
--- a/Manuscript docs/Tables and Figures File 9.30.22.docx
+++ b/Manuscript docs/Tables and Figures File 9.30.22.docx
@@ -4373,8 +4373,6 @@
         <w:spacing w:line="480" w:lineRule="auto"/>
         <w:rPr>
           <w:rFonts w:ascii="Times New Roman" w:hAnsi="Times New Roman" w:cs="Times New Roman"/>
-          <w:i/>
-          <w:iCs/>
           <w:sz w:val="24"/>
           <w:szCs w:val="24"/>
         </w:rPr>
@@ -4402,7 +4400,45 @@
           <w:sz w:val="24"/>
           <w:szCs w:val="24"/>
         </w:rPr>
-        <w:t>4. Standardized effect sizes (SES) of observed functional trait groups in urban farms, vacant lots, and high diversity pocket prairies in Cleveland, Ohio, USA. Positive SES values indicate the functional trait category was observed at higher rates than in the average null model expectations of the city. Negative SES values indicate the functional group was observed at rates lower than Cleveland’s average null model expectations.</w:t>
+        <w:t xml:space="preserve">4. Standardized effect sizes (SES) of observed functional trait groups in urban farms, </w:t>
+      </w:r>
+      <w:r>
+        <w:rPr>
+          <w:rFonts w:ascii="Times New Roman" w:hAnsi="Times New Roman" w:cs="Times New Roman"/>
+          <w:sz w:val="24"/>
+          <w:szCs w:val="24"/>
+        </w:rPr>
+        <w:t>and vacant lots</w:t>
+      </w:r>
+      <w:r>
+        <w:rPr>
+          <w:rFonts w:ascii="Times New Roman" w:hAnsi="Times New Roman" w:cs="Times New Roman"/>
+          <w:sz w:val="24"/>
+          <w:szCs w:val="24"/>
+        </w:rPr>
+        <w:t xml:space="preserve"> in Cleveland, Ohio, USA. Positive SES values indicate the functional trait category was observed at higher rates than in the average null model expectations of the city. Negative SES values indicate the functional group was observed at rates lower than Cleveland’s average null model expectations.</w:t>
+      </w:r>
+    </w:p>
+    <w:p>
+      <w:pPr>
+        <w:spacing w:line="480" w:lineRule="auto"/>
+        <w:rPr>
+          <w:rFonts w:ascii="Times New Roman" w:hAnsi="Times New Roman" w:cs="Times New Roman"/>
+          <w:i/>
+          <w:iCs/>
+          <w:sz w:val="24"/>
+          <w:szCs w:val="24"/>
+        </w:rPr>
+      </w:pPr>
+      <w:r>
+        <w:rPr>
+          <w:rFonts w:ascii="Times New Roman" w:hAnsi="Times New Roman" w:cs="Times New Roman"/>
+          <w:i/>
+          <w:iCs/>
+          <w:sz w:val="24"/>
+          <w:szCs w:val="24"/>
+        </w:rPr>
+        <w:t xml:space="preserve">Currently I’m separating Francis and Katie’s results completely </w:t>
       </w:r>
     </w:p>
     <w:tbl>
@@ -4421,23 +4457,21 @@
         <w:tblLook w:val="0000" w:firstRow="0" w:lastRow="0" w:firstColumn="0" w:lastColumn="0" w:noHBand="0" w:noVBand="0"/>
       </w:tblPr>
       <w:tblGrid>
-        <w:gridCol w:w="237"/>
-        <w:gridCol w:w="1297"/>
+        <w:gridCol w:w="241"/>
+        <w:gridCol w:w="1293"/>
         <w:gridCol w:w="1724"/>
         <w:gridCol w:w="1286"/>
         <w:gridCol w:w="1244"/>
         <w:gridCol w:w="60"/>
         <w:gridCol w:w="1286"/>
-        <w:gridCol w:w="1286"/>
-        <w:gridCol w:w="44"/>
-        <w:gridCol w:w="1242"/>
-        <w:gridCol w:w="1382"/>
-        <w:gridCol w:w="20"/>
+        <w:gridCol w:w="1277"/>
+        <w:gridCol w:w="104"/>
+        <w:gridCol w:w="2593"/>
       </w:tblGrid>
       <w:tr>
         <w:trPr>
-          <w:gridAfter w:val="1"/>
-          <w:wAfter w:w="9" w:type="pct"/>
+          <w:gridAfter w:val="2"/>
+          <w:wAfter w:w="1214" w:type="pct"/>
           <w:trHeight w:val="98"/>
         </w:trPr>
         <w:tc>
@@ -4531,14 +4565,14 @@
                 <w:iCs/>
                 <w:szCs w:val="24"/>
               </w:rPr>
-              <w:t>Urban Farms</w:t>
+              <w:t>Vacant Lots(control)</w:t>
             </w:r>
           </w:p>
         </w:tc>
         <w:tc>
           <w:tcPr>
-            <w:tcW w:w="1205" w:type="pct"/>
-            <w:gridSpan w:val="4"/>
+            <w:tcW w:w="1181" w:type="pct"/>
+            <w:gridSpan w:val="3"/>
             <w:tcBorders>
               <w:left w:val="nil"/>
               <w:bottom w:val="single" w:sz="4" w:space="0" w:color="auto"/>
@@ -4563,39 +4597,7 @@
                 <w:iCs/>
                 <w:szCs w:val="24"/>
               </w:rPr>
-              <w:t>Vacant Lots</w:t>
-            </w:r>
-          </w:p>
-        </w:tc>
-        <w:tc>
-          <w:tcPr>
-            <w:tcW w:w="1181" w:type="pct"/>
-            <w:gridSpan w:val="2"/>
-            <w:tcBorders>
-              <w:left w:val="nil"/>
-              <w:bottom w:val="single" w:sz="4" w:space="0" w:color="auto"/>
-              <w:right w:val="nil"/>
-            </w:tcBorders>
-            <w:vAlign w:val="bottom"/>
-          </w:tcPr>
-          <w:p>
-            <w:pPr>
-              <w:jc w:val="center"/>
-              <w:rPr>
-                <w:rFonts w:ascii="Times New Roman" w:hAnsi="Times New Roman" w:cs="Times New Roman"/>
-                <w:i/>
-                <w:iCs/>
-                <w:szCs w:val="24"/>
-              </w:rPr>
-            </w:pPr>
-            <w:r>
-              <w:rPr>
-                <w:rFonts w:ascii="Times New Roman" w:hAnsi="Times New Roman" w:cs="Times New Roman"/>
-                <w:i/>
-                <w:iCs/>
-                <w:szCs w:val="24"/>
-              </w:rPr>
-              <w:t>High Diversity Prairies</w:t>
+              <w:t>Urban Farms</w:t>
             </w:r>
           </w:p>
         </w:tc>
@@ -4603,7 +4605,7 @@
       <w:tr>
         <w:trPr>
           <w:gridAfter w:val="1"/>
-          <w:wAfter w:w="9" w:type="pct"/>
+          <w:wAfter w:w="1167" w:type="pct"/>
           <w:trHeight w:val="345"/>
         </w:trPr>
         <w:tc>
@@ -4722,6 +4724,7 @@
               <w:bottom w:val="single" w:sz="4" w:space="0" w:color="auto"/>
               <w:right w:val="nil"/>
             </w:tcBorders>
+            <w:vAlign w:val="bottom"/>
           </w:tcPr>
           <w:p>
             <w:pPr>
@@ -4746,37 +4749,7 @@
         </w:tc>
         <w:tc>
           <w:tcPr>
-            <w:tcW w:w="579" w:type="pct"/>
-            <w:tcBorders>
-              <w:left w:val="nil"/>
-              <w:bottom w:val="single" w:sz="4" w:space="0" w:color="auto"/>
-              <w:right w:val="nil"/>
-            </w:tcBorders>
-          </w:tcPr>
-          <w:p>
-            <w:pPr>
-              <w:jc w:val="center"/>
-              <w:rPr>
-                <w:rFonts w:ascii="Times New Roman" w:hAnsi="Times New Roman" w:cs="Times New Roman"/>
-                <w:i/>
-                <w:iCs/>
-                <w:szCs w:val="24"/>
-              </w:rPr>
-            </w:pPr>
-            <w:r>
-              <w:rPr>
-                <w:rFonts w:ascii="Times New Roman" w:hAnsi="Times New Roman" w:cs="Times New Roman"/>
-                <w:i/>
-                <w:iCs/>
-                <w:szCs w:val="24"/>
-              </w:rPr>
-              <w:t>p-value</w:t>
-            </w:r>
-          </w:p>
-        </w:tc>
-        <w:tc>
-          <w:tcPr>
-            <w:tcW w:w="579" w:type="pct"/>
+            <w:tcW w:w="622" w:type="pct"/>
             <w:gridSpan w:val="2"/>
             <w:tcBorders>
               <w:left w:val="nil"/>
@@ -4802,37 +4775,6 @@
                 <w:iCs/>
                 <w:szCs w:val="24"/>
               </w:rPr>
-              <w:t>SES</w:t>
-            </w:r>
-          </w:p>
-        </w:tc>
-        <w:tc>
-          <w:tcPr>
-            <w:tcW w:w="622" w:type="pct"/>
-            <w:tcBorders>
-              <w:left w:val="nil"/>
-              <w:bottom w:val="single" w:sz="4" w:space="0" w:color="auto"/>
-              <w:right w:val="nil"/>
-            </w:tcBorders>
-            <w:vAlign w:val="bottom"/>
-          </w:tcPr>
-          <w:p>
-            <w:pPr>
-              <w:jc w:val="center"/>
-              <w:rPr>
-                <w:rFonts w:ascii="Times New Roman" w:hAnsi="Times New Roman" w:cs="Times New Roman"/>
-                <w:i/>
-                <w:iCs/>
-                <w:szCs w:val="24"/>
-              </w:rPr>
-            </w:pPr>
-            <w:r>
-              <w:rPr>
-                <w:rFonts w:ascii="Times New Roman" w:hAnsi="Times New Roman" w:cs="Times New Roman"/>
-                <w:i/>
-                <w:iCs/>
-                <w:szCs w:val="24"/>
-              </w:rPr>
               <w:t>p-value</w:t>
             </w:r>
           </w:p>
@@ -4841,7 +4783,7 @@
       <w:tr>
         <w:trPr>
           <w:gridAfter w:val="1"/>
-          <w:wAfter w:w="9" w:type="pct"/>
+          <w:wAfter w:w="1167" w:type="pct"/>
           <w:trHeight w:val="96"/>
         </w:trPr>
         <w:tc>
@@ -5318,7 +5260,23 @@
                 <w:color w:val="000000"/>
                 <w:szCs w:val="24"/>
               </w:rPr>
-              <w:t>-0.080</w:t>
+              <w:t>0.0</w:t>
+            </w:r>
+            <w:r>
+              <w:rPr>
+                <w:rFonts w:ascii="Times New Roman" w:hAnsi="Times New Roman" w:cs="Times New Roman"/>
+                <w:color w:val="000000"/>
+                <w:szCs w:val="24"/>
+              </w:rPr>
+              <w:t>6</w:t>
+            </w:r>
+            <w:r>
+              <w:rPr>
+                <w:rFonts w:ascii="Times New Roman" w:hAnsi="Times New Roman" w:cs="Times New Roman"/>
+                <w:color w:val="000000"/>
+                <w:szCs w:val="24"/>
+              </w:rPr>
+              <w:t>8</w:t>
             </w:r>
           </w:p>
           <w:p>
@@ -5598,7 +5556,15 @@
                 <w:color w:val="000000"/>
                 <w:szCs w:val="24"/>
               </w:rPr>
-              <w:t>0.844</w:t>
+              <w:t>0.</w:t>
+            </w:r>
+            <w:r>
+              <w:rPr>
+                <w:rFonts w:ascii="Times New Roman" w:hAnsi="Times New Roman" w:cs="Times New Roman"/>
+                <w:color w:val="000000"/>
+                <w:szCs w:val="24"/>
+              </w:rPr>
+              <w:t>910</w:t>
             </w:r>
           </w:p>
           <w:p>
@@ -5908,583 +5874,265 @@
                 <w:color w:val="000000"/>
                 <w:szCs w:val="24"/>
               </w:rPr>
-              <w:t>0.164</w:t>
-            </w:r>
-          </w:p>
-          <w:p>
-            <w:pPr>
-              <w:jc w:val="center"/>
-              <w:rPr>
-                <w:rFonts w:ascii="Times New Roman" w:hAnsi="Times New Roman" w:cs="Times New Roman"/>
-                <w:color w:val="000000"/>
-                <w:szCs w:val="24"/>
-              </w:rPr>
-            </w:pPr>
-            <w:r>
-              <w:rPr>
-                <w:rFonts w:ascii="Times New Roman" w:hAnsi="Times New Roman" w:cs="Times New Roman"/>
-                <w:color w:val="000000"/>
-                <w:szCs w:val="24"/>
-              </w:rPr>
-              <w:t>-1.926</w:t>
-            </w:r>
-          </w:p>
-          <w:p>
-            <w:pPr>
-              <w:jc w:val="center"/>
-              <w:rPr>
-                <w:rFonts w:ascii="Times New Roman" w:hAnsi="Times New Roman" w:cs="Times New Roman"/>
-                <w:color w:val="000000"/>
-                <w:szCs w:val="24"/>
-              </w:rPr>
-            </w:pPr>
-            <w:r>
-              <w:rPr>
-                <w:rFonts w:ascii="Times New Roman" w:hAnsi="Times New Roman" w:cs="Times New Roman"/>
-                <w:color w:val="000000"/>
-                <w:szCs w:val="24"/>
-              </w:rPr>
-              <w:t>2.389</w:t>
-            </w:r>
-          </w:p>
-          <w:p>
-            <w:pPr>
-              <w:jc w:val="center"/>
-              <w:rPr>
-                <w:rFonts w:ascii="Times New Roman" w:hAnsi="Times New Roman" w:cs="Times New Roman"/>
-                <w:color w:val="000000"/>
-                <w:szCs w:val="24"/>
-              </w:rPr>
-            </w:pPr>
-            <w:r>
-              <w:rPr>
-                <w:rFonts w:ascii="Times New Roman" w:hAnsi="Times New Roman" w:cs="Times New Roman"/>
-                <w:color w:val="000000"/>
-                <w:szCs w:val="24"/>
-              </w:rPr>
-              <w:t>-1.230</w:t>
-            </w:r>
-          </w:p>
-          <w:p>
-            <w:pPr>
-              <w:jc w:val="center"/>
-              <w:rPr>
-                <w:rFonts w:ascii="Times New Roman" w:hAnsi="Times New Roman" w:cs="Times New Roman"/>
-                <w:color w:val="000000"/>
-                <w:szCs w:val="24"/>
-              </w:rPr>
-            </w:pPr>
-            <w:r>
-              <w:rPr>
-                <w:rFonts w:ascii="Times New Roman" w:hAnsi="Times New Roman" w:cs="Times New Roman"/>
-                <w:color w:val="000000"/>
-                <w:szCs w:val="24"/>
-              </w:rPr>
-              <w:t>-0.235</w:t>
-            </w:r>
-          </w:p>
-          <w:p>
-            <w:pPr>
-              <w:jc w:val="center"/>
-              <w:rPr>
-                <w:rFonts w:ascii="Times New Roman" w:hAnsi="Times New Roman" w:cs="Times New Roman"/>
-                <w:color w:val="000000"/>
-                <w:szCs w:val="24"/>
-              </w:rPr>
-            </w:pPr>
-            <w:r>
-              <w:rPr>
-                <w:rFonts w:ascii="Times New Roman" w:hAnsi="Times New Roman" w:cs="Times New Roman"/>
-                <w:color w:val="000000"/>
-                <w:szCs w:val="24"/>
-              </w:rPr>
-              <w:t>-0.353</w:t>
-            </w:r>
-          </w:p>
-          <w:p>
-            <w:pPr>
-              <w:jc w:val="center"/>
-              <w:rPr>
-                <w:rFonts w:ascii="Times New Roman" w:hAnsi="Times New Roman" w:cs="Times New Roman"/>
-                <w:color w:val="000000"/>
-                <w:szCs w:val="24"/>
-              </w:rPr>
-            </w:pPr>
-            <w:r>
-              <w:rPr>
-                <w:rFonts w:ascii="Times New Roman" w:hAnsi="Times New Roman" w:cs="Times New Roman"/>
-                <w:color w:val="000000"/>
-                <w:szCs w:val="24"/>
-              </w:rPr>
-              <w:t>1.601</w:t>
-            </w:r>
-          </w:p>
-          <w:p>
-            <w:pPr>
-              <w:jc w:val="center"/>
-              <w:rPr>
-                <w:rFonts w:ascii="Times New Roman" w:hAnsi="Times New Roman" w:cs="Times New Roman"/>
-                <w:color w:val="000000"/>
-                <w:szCs w:val="24"/>
-              </w:rPr>
-            </w:pPr>
-            <w:r>
-              <w:rPr>
-                <w:rFonts w:ascii="Times New Roman" w:hAnsi="Times New Roman" w:cs="Times New Roman"/>
-                <w:color w:val="000000"/>
-                <w:szCs w:val="24"/>
-              </w:rPr>
-              <w:t>-0.020</w:t>
-            </w:r>
-          </w:p>
-          <w:p>
-            <w:pPr>
-              <w:jc w:val="center"/>
-              <w:rPr>
-                <w:rFonts w:ascii="Times New Roman" w:hAnsi="Times New Roman" w:cs="Times New Roman"/>
-                <w:color w:val="000000"/>
-                <w:szCs w:val="24"/>
-              </w:rPr>
-            </w:pPr>
-            <w:r>
-              <w:rPr>
-                <w:rFonts w:ascii="Times New Roman" w:hAnsi="Times New Roman" w:cs="Times New Roman"/>
-                <w:color w:val="000000"/>
-                <w:szCs w:val="24"/>
-              </w:rPr>
-              <w:t>0.225</w:t>
-            </w:r>
-          </w:p>
-          <w:p>
-            <w:pPr>
-              <w:jc w:val="center"/>
-              <w:rPr>
-                <w:rFonts w:ascii="Times New Roman" w:hAnsi="Times New Roman" w:cs="Times New Roman"/>
-                <w:color w:val="000000"/>
-                <w:szCs w:val="24"/>
-              </w:rPr>
-            </w:pPr>
-            <w:r>
-              <w:rPr>
-                <w:rFonts w:ascii="Times New Roman" w:hAnsi="Times New Roman" w:cs="Times New Roman"/>
-                <w:color w:val="000000"/>
-                <w:szCs w:val="24"/>
-              </w:rPr>
-              <w:t>1.577</w:t>
-            </w:r>
-          </w:p>
-          <w:p>
-            <w:pPr>
-              <w:jc w:val="center"/>
-              <w:rPr>
-                <w:rFonts w:ascii="Times New Roman" w:hAnsi="Times New Roman" w:cs="Times New Roman"/>
-                <w:color w:val="000000"/>
-                <w:szCs w:val="24"/>
-              </w:rPr>
-            </w:pPr>
-            <w:r>
-              <w:rPr>
-                <w:rFonts w:ascii="Times New Roman" w:hAnsi="Times New Roman" w:cs="Times New Roman"/>
-                <w:color w:val="000000"/>
-                <w:szCs w:val="24"/>
-              </w:rPr>
-              <w:t>-0.736</w:t>
-            </w:r>
-          </w:p>
-          <w:p>
-            <w:pPr>
-              <w:jc w:val="center"/>
-              <w:rPr>
-                <w:rFonts w:ascii="Times New Roman" w:hAnsi="Times New Roman" w:cs="Times New Roman"/>
-                <w:color w:val="000000"/>
-                <w:szCs w:val="24"/>
-              </w:rPr>
-            </w:pPr>
-            <w:r>
-              <w:rPr>
-                <w:rFonts w:ascii="Times New Roman" w:hAnsi="Times New Roman" w:cs="Times New Roman"/>
-                <w:color w:val="000000"/>
-                <w:szCs w:val="24"/>
-              </w:rPr>
-              <w:t>1.557</w:t>
-            </w:r>
-          </w:p>
-          <w:p>
-            <w:pPr>
-              <w:jc w:val="center"/>
-              <w:rPr>
-                <w:rFonts w:ascii="Times New Roman" w:hAnsi="Times New Roman" w:cs="Times New Roman"/>
-                <w:color w:val="000000"/>
-                <w:szCs w:val="24"/>
-              </w:rPr>
-            </w:pPr>
-            <w:r>
-              <w:rPr>
-                <w:rFonts w:ascii="Times New Roman" w:hAnsi="Times New Roman" w:cs="Times New Roman"/>
-                <w:color w:val="000000"/>
-                <w:szCs w:val="24"/>
-              </w:rPr>
-              <w:t>-2.088</w:t>
-            </w:r>
-          </w:p>
-          <w:p>
-            <w:pPr>
-              <w:jc w:val="center"/>
-              <w:rPr>
-                <w:rFonts w:ascii="Times New Roman" w:hAnsi="Times New Roman" w:cs="Times New Roman"/>
-                <w:color w:val="000000"/>
-                <w:szCs w:val="24"/>
-              </w:rPr>
-            </w:pPr>
-            <w:r>
-              <w:rPr>
-                <w:rFonts w:ascii="Times New Roman" w:hAnsi="Times New Roman" w:cs="Times New Roman"/>
-                <w:color w:val="000000"/>
-                <w:szCs w:val="24"/>
-              </w:rPr>
-              <w:t>-1.179</w:t>
-            </w:r>
-          </w:p>
-          <w:p>
-            <w:pPr>
-              <w:jc w:val="center"/>
-              <w:rPr>
-                <w:rFonts w:ascii="Times New Roman" w:hAnsi="Times New Roman" w:cs="Times New Roman"/>
-                <w:color w:val="000000"/>
-                <w:szCs w:val="24"/>
-              </w:rPr>
-            </w:pPr>
-            <w:r>
-              <w:rPr>
-                <w:rFonts w:ascii="Times New Roman" w:hAnsi="Times New Roman" w:cs="Times New Roman"/>
-                <w:color w:val="000000"/>
-                <w:szCs w:val="24"/>
-              </w:rPr>
-              <w:t>1.179</w:t>
+              <w:t>0.080</w:t>
+            </w:r>
+          </w:p>
+          <w:p>
+            <w:pPr>
+              <w:jc w:val="center"/>
+              <w:rPr>
+                <w:rFonts w:ascii="Times New Roman" w:hAnsi="Times New Roman" w:cs="Times New Roman"/>
+                <w:color w:val="000000"/>
+                <w:szCs w:val="24"/>
+              </w:rPr>
+            </w:pPr>
+            <w:r>
+              <w:rPr>
+                <w:rFonts w:ascii="Times New Roman" w:hAnsi="Times New Roman" w:cs="Times New Roman"/>
+                <w:color w:val="000000"/>
+                <w:szCs w:val="24"/>
+              </w:rPr>
+              <w:t>-1.935</w:t>
+            </w:r>
+          </w:p>
+          <w:p>
+            <w:pPr>
+              <w:jc w:val="center"/>
+              <w:rPr>
+                <w:rFonts w:ascii="Times New Roman" w:hAnsi="Times New Roman" w:cs="Times New Roman"/>
+                <w:color w:val="000000"/>
+                <w:szCs w:val="24"/>
+              </w:rPr>
+            </w:pPr>
+            <w:r>
+              <w:rPr>
+                <w:rFonts w:ascii="Times New Roman" w:hAnsi="Times New Roman" w:cs="Times New Roman"/>
+                <w:color w:val="000000"/>
+                <w:szCs w:val="24"/>
+              </w:rPr>
+              <w:t>1.869</w:t>
+            </w:r>
+          </w:p>
+          <w:p>
+            <w:pPr>
+              <w:jc w:val="center"/>
+              <w:rPr>
+                <w:rFonts w:ascii="Times New Roman" w:hAnsi="Times New Roman" w:cs="Times New Roman"/>
+                <w:color w:val="000000"/>
+                <w:szCs w:val="24"/>
+              </w:rPr>
+            </w:pPr>
+            <w:r>
+              <w:rPr>
+                <w:rFonts w:ascii="Times New Roman" w:hAnsi="Times New Roman" w:cs="Times New Roman"/>
+                <w:color w:val="000000"/>
+                <w:szCs w:val="24"/>
+              </w:rPr>
+              <w:t>-0.295</w:t>
+            </w:r>
+          </w:p>
+          <w:p>
+            <w:pPr>
+              <w:jc w:val="center"/>
+              <w:rPr>
+                <w:rFonts w:ascii="Times New Roman" w:hAnsi="Times New Roman" w:cs="Times New Roman"/>
+                <w:color w:val="000000"/>
+                <w:szCs w:val="24"/>
+              </w:rPr>
+            </w:pPr>
+            <w:r>
+              <w:rPr>
+                <w:rFonts w:ascii="Times New Roman" w:hAnsi="Times New Roman" w:cs="Times New Roman"/>
+                <w:color w:val="000000"/>
+                <w:szCs w:val="24"/>
+              </w:rPr>
+              <w:t>0.664</w:t>
+            </w:r>
+          </w:p>
+          <w:p>
+            <w:pPr>
+              <w:jc w:val="center"/>
+              <w:rPr>
+                <w:rFonts w:ascii="Times New Roman" w:hAnsi="Times New Roman" w:cs="Times New Roman"/>
+                <w:color w:val="000000"/>
+                <w:szCs w:val="24"/>
+              </w:rPr>
+            </w:pPr>
+            <w:r>
+              <w:rPr>
+                <w:rFonts w:ascii="Times New Roman" w:hAnsi="Times New Roman" w:cs="Times New Roman"/>
+                <w:color w:val="000000"/>
+                <w:szCs w:val="24"/>
+              </w:rPr>
+              <w:t>-1.486</w:t>
+            </w:r>
+          </w:p>
+          <w:p>
+            <w:pPr>
+              <w:jc w:val="center"/>
+              <w:rPr>
+                <w:rFonts w:ascii="Times New Roman" w:hAnsi="Times New Roman" w:cs="Times New Roman"/>
+                <w:color w:val="000000"/>
+                <w:szCs w:val="24"/>
+              </w:rPr>
+            </w:pPr>
+            <w:r>
+              <w:rPr>
+                <w:rFonts w:ascii="Times New Roman" w:hAnsi="Times New Roman" w:cs="Times New Roman"/>
+                <w:color w:val="000000"/>
+                <w:szCs w:val="24"/>
+              </w:rPr>
+              <w:t>1.114</w:t>
+            </w:r>
+          </w:p>
+          <w:p>
+            <w:pPr>
+              <w:jc w:val="center"/>
+              <w:rPr>
+                <w:rFonts w:ascii="Times New Roman" w:hAnsi="Times New Roman" w:cs="Times New Roman"/>
+                <w:color w:val="000000"/>
+                <w:szCs w:val="24"/>
+              </w:rPr>
+            </w:pPr>
+            <w:r>
+              <w:rPr>
+                <w:rFonts w:ascii="Times New Roman" w:hAnsi="Times New Roman" w:cs="Times New Roman"/>
+                <w:color w:val="000000"/>
+                <w:szCs w:val="24"/>
+              </w:rPr>
+              <w:t>0.054</w:t>
+            </w:r>
+          </w:p>
+          <w:p>
+            <w:pPr>
+              <w:jc w:val="center"/>
+              <w:rPr>
+                <w:rFonts w:ascii="Times New Roman" w:hAnsi="Times New Roman" w:cs="Times New Roman"/>
+                <w:color w:val="000000"/>
+                <w:szCs w:val="24"/>
+              </w:rPr>
+            </w:pPr>
+            <w:r>
+              <w:rPr>
+                <w:rFonts w:ascii="Times New Roman" w:hAnsi="Times New Roman" w:cs="Times New Roman"/>
+                <w:color w:val="000000"/>
+                <w:szCs w:val="24"/>
+              </w:rPr>
+              <w:t>-0.131</w:t>
+            </w:r>
+          </w:p>
+          <w:p>
+            <w:pPr>
+              <w:jc w:val="center"/>
+              <w:rPr>
+                <w:rFonts w:ascii="Times New Roman" w:hAnsi="Times New Roman" w:cs="Times New Roman"/>
+                <w:color w:val="000000"/>
+                <w:szCs w:val="24"/>
+              </w:rPr>
+            </w:pPr>
+            <w:r>
+              <w:rPr>
+                <w:rFonts w:ascii="Times New Roman" w:hAnsi="Times New Roman" w:cs="Times New Roman"/>
+                <w:color w:val="000000"/>
+                <w:szCs w:val="24"/>
+              </w:rPr>
+              <w:t>1.781</w:t>
+            </w:r>
+          </w:p>
+          <w:p>
+            <w:pPr>
+              <w:jc w:val="center"/>
+              <w:rPr>
+                <w:rFonts w:ascii="Times New Roman" w:hAnsi="Times New Roman" w:cs="Times New Roman"/>
+                <w:color w:val="000000"/>
+                <w:szCs w:val="24"/>
+              </w:rPr>
+            </w:pPr>
+            <w:r>
+              <w:rPr>
+                <w:rFonts w:ascii="Times New Roman" w:hAnsi="Times New Roman" w:cs="Times New Roman"/>
+                <w:color w:val="000000"/>
+                <w:szCs w:val="24"/>
+              </w:rPr>
+              <w:t>-1.412</w:t>
+            </w:r>
+          </w:p>
+          <w:p>
+            <w:pPr>
+              <w:jc w:val="center"/>
+              <w:rPr>
+                <w:rFonts w:ascii="Times New Roman" w:hAnsi="Times New Roman" w:cs="Times New Roman"/>
+                <w:color w:val="000000"/>
+                <w:szCs w:val="24"/>
+              </w:rPr>
+            </w:pPr>
+            <w:r>
+              <w:rPr>
+                <w:rFonts w:ascii="Times New Roman" w:hAnsi="Times New Roman" w:cs="Times New Roman"/>
+                <w:color w:val="000000"/>
+                <w:szCs w:val="24"/>
+              </w:rPr>
+              <w:t>1.857</w:t>
+            </w:r>
+          </w:p>
+          <w:p>
+            <w:pPr>
+              <w:jc w:val="center"/>
+              <w:rPr>
+                <w:rFonts w:ascii="Times New Roman" w:hAnsi="Times New Roman" w:cs="Times New Roman"/>
+                <w:color w:val="000000"/>
+                <w:szCs w:val="24"/>
+              </w:rPr>
+            </w:pPr>
+            <w:r>
+              <w:rPr>
+                <w:rFonts w:ascii="Times New Roman" w:hAnsi="Times New Roman" w:cs="Times New Roman"/>
+                <w:color w:val="000000"/>
+                <w:szCs w:val="24"/>
+              </w:rPr>
+              <w:t>-2.174</w:t>
+            </w:r>
+          </w:p>
+          <w:p>
+            <w:pPr>
+              <w:jc w:val="center"/>
+              <w:rPr>
+                <w:rFonts w:ascii="Times New Roman" w:hAnsi="Times New Roman" w:cs="Times New Roman"/>
+                <w:color w:val="000000"/>
+                <w:szCs w:val="24"/>
+              </w:rPr>
+            </w:pPr>
+            <w:r>
+              <w:rPr>
+                <w:rFonts w:ascii="Times New Roman" w:hAnsi="Times New Roman" w:cs="Times New Roman"/>
+                <w:color w:val="000000"/>
+                <w:szCs w:val="24"/>
+              </w:rPr>
+              <w:t>-0.359</w:t>
+            </w:r>
+          </w:p>
+          <w:p>
+            <w:pPr>
+              <w:jc w:val="center"/>
+              <w:rPr>
+                <w:rFonts w:ascii="Times New Roman" w:hAnsi="Times New Roman" w:cs="Times New Roman"/>
+                <w:color w:val="000000"/>
+                <w:szCs w:val="24"/>
+              </w:rPr>
+            </w:pPr>
+            <w:r>
+              <w:rPr>
+                <w:rFonts w:ascii="Times New Roman" w:hAnsi="Times New Roman" w:cs="Times New Roman"/>
+                <w:color w:val="000000"/>
+                <w:szCs w:val="24"/>
+              </w:rPr>
+              <w:t>0.359</w:t>
             </w:r>
           </w:p>
         </w:tc>
         <w:tc>
           <w:tcPr>
-            <w:tcW w:w="579" w:type="pct"/>
-            <w:tcBorders>
-              <w:left w:val="nil"/>
-              <w:bottom w:val="single" w:sz="4" w:space="0" w:color="auto"/>
-              <w:right w:val="nil"/>
-            </w:tcBorders>
-          </w:tcPr>
-          <w:p>
-            <w:pPr>
-              <w:jc w:val="center"/>
-              <w:rPr>
-                <w:rFonts w:ascii="Times New Roman" w:hAnsi="Times New Roman" w:cs="Times New Roman"/>
-                <w:color w:val="000000"/>
-                <w:szCs w:val="24"/>
-              </w:rPr>
-            </w:pPr>
-            <w:r>
-              <w:rPr>
-                <w:rFonts w:ascii="Times New Roman" w:hAnsi="Times New Roman" w:cs="Times New Roman"/>
-                <w:color w:val="000000"/>
-                <w:szCs w:val="24"/>
-              </w:rPr>
-              <w:t>0.644</w:t>
-            </w:r>
-          </w:p>
-          <w:p>
-            <w:pPr>
-              <w:jc w:val="center"/>
-              <w:rPr>
-                <w:rFonts w:ascii="Times New Roman" w:hAnsi="Times New Roman" w:cs="Times New Roman"/>
-                <w:b/>
-                <w:bCs/>
-                <w:color w:val="000000"/>
-                <w:szCs w:val="24"/>
-              </w:rPr>
-            </w:pPr>
-            <w:r>
-              <w:rPr>
-                <w:rFonts w:ascii="Times New Roman" w:hAnsi="Times New Roman" w:cs="Times New Roman"/>
-                <w:b/>
-                <w:bCs/>
-                <w:color w:val="000000"/>
-                <w:szCs w:val="24"/>
-              </w:rPr>
-              <w:t>&lt; 0.001</w:t>
-            </w:r>
-          </w:p>
-          <w:p>
-            <w:pPr>
-              <w:jc w:val="center"/>
-              <w:rPr>
-                <w:rFonts w:ascii="Times New Roman" w:hAnsi="Times New Roman" w:cs="Times New Roman"/>
-                <w:b/>
-                <w:bCs/>
-                <w:color w:val="000000"/>
-                <w:szCs w:val="24"/>
-              </w:rPr>
-            </w:pPr>
-            <w:r>
-              <w:rPr>
-                <w:rFonts w:ascii="Times New Roman" w:hAnsi="Times New Roman" w:cs="Times New Roman"/>
-                <w:b/>
-                <w:bCs/>
-                <w:color w:val="000000"/>
-                <w:szCs w:val="24"/>
-              </w:rPr>
-              <w:t>&lt; 0.001</w:t>
-            </w:r>
-          </w:p>
-          <w:p>
-            <w:pPr>
-              <w:jc w:val="center"/>
-              <w:rPr>
-                <w:rFonts w:ascii="Times New Roman" w:hAnsi="Times New Roman" w:cs="Times New Roman"/>
-                <w:b/>
-                <w:bCs/>
-                <w:color w:val="000000"/>
-                <w:szCs w:val="24"/>
-              </w:rPr>
-            </w:pPr>
-            <w:r>
-              <w:rPr>
-                <w:rFonts w:ascii="Times New Roman" w:hAnsi="Times New Roman" w:cs="Times New Roman"/>
-                <w:b/>
-                <w:bCs/>
-                <w:color w:val="000000"/>
-                <w:szCs w:val="24"/>
-              </w:rPr>
-              <w:t>&lt; 0.001</w:t>
-            </w:r>
-          </w:p>
-          <w:p>
-            <w:pPr>
-              <w:jc w:val="center"/>
-              <w:rPr>
-                <w:rFonts w:ascii="Times New Roman" w:hAnsi="Times New Roman" w:cs="Times New Roman"/>
-                <w:color w:val="000000"/>
-                <w:szCs w:val="24"/>
-              </w:rPr>
-            </w:pPr>
-            <w:r>
-              <w:rPr>
-                <w:rFonts w:ascii="Times New Roman" w:hAnsi="Times New Roman" w:cs="Times New Roman"/>
-                <w:color w:val="000000"/>
-                <w:szCs w:val="24"/>
-              </w:rPr>
-              <w:t>0.263</w:t>
-            </w:r>
-          </w:p>
-          <w:p>
-            <w:pPr>
-              <w:jc w:val="center"/>
-              <w:rPr>
-                <w:rFonts w:ascii="Times New Roman" w:hAnsi="Times New Roman" w:cs="Times New Roman"/>
-                <w:color w:val="000000"/>
-                <w:szCs w:val="24"/>
-              </w:rPr>
-            </w:pPr>
-            <w:r>
-              <w:rPr>
-                <w:rFonts w:ascii="Times New Roman" w:hAnsi="Times New Roman" w:cs="Times New Roman"/>
-                <w:color w:val="000000"/>
-                <w:szCs w:val="24"/>
-              </w:rPr>
-              <w:t>0.089</w:t>
-            </w:r>
-          </w:p>
-          <w:p>
-            <w:pPr>
-              <w:jc w:val="center"/>
-              <w:rPr>
-                <w:rFonts w:ascii="Times New Roman" w:hAnsi="Times New Roman" w:cs="Times New Roman"/>
-                <w:b/>
-                <w:bCs/>
-                <w:color w:val="000000"/>
-                <w:szCs w:val="24"/>
-              </w:rPr>
-            </w:pPr>
-            <w:r>
-              <w:rPr>
-                <w:rFonts w:ascii="Times New Roman" w:hAnsi="Times New Roman" w:cs="Times New Roman"/>
-                <w:b/>
-                <w:bCs/>
-                <w:color w:val="000000"/>
-                <w:szCs w:val="24"/>
-              </w:rPr>
-              <w:t>0.001</w:t>
-            </w:r>
-          </w:p>
-          <w:p>
-            <w:pPr>
-              <w:jc w:val="center"/>
-              <w:rPr>
-                <w:rFonts w:ascii="Times New Roman" w:hAnsi="Times New Roman" w:cs="Times New Roman"/>
-                <w:color w:val="000000"/>
-                <w:szCs w:val="24"/>
-              </w:rPr>
-            </w:pPr>
-            <w:r>
-              <w:rPr>
-                <w:rFonts w:ascii="Times New Roman" w:hAnsi="Times New Roman" w:cs="Times New Roman"/>
-                <w:color w:val="000000"/>
-                <w:szCs w:val="24"/>
-              </w:rPr>
-              <w:t>0.89</w:t>
-            </w:r>
-          </w:p>
-          <w:p>
-            <w:pPr>
-              <w:jc w:val="center"/>
-              <w:rPr>
-                <w:rFonts w:ascii="Times New Roman" w:hAnsi="Times New Roman" w:cs="Times New Roman"/>
-                <w:color w:val="000000"/>
-                <w:szCs w:val="24"/>
-              </w:rPr>
-            </w:pPr>
-            <w:r>
-              <w:rPr>
-                <w:rFonts w:ascii="Times New Roman" w:hAnsi="Times New Roman" w:cs="Times New Roman"/>
-                <w:color w:val="000000"/>
-                <w:szCs w:val="24"/>
-              </w:rPr>
-              <w:t>0.207</w:t>
-            </w:r>
-          </w:p>
-          <w:p>
-            <w:pPr>
-              <w:jc w:val="center"/>
-              <w:rPr>
-                <w:rFonts w:ascii="Times New Roman" w:hAnsi="Times New Roman" w:cs="Times New Roman"/>
-                <w:b/>
-                <w:bCs/>
-                <w:color w:val="000000"/>
-                <w:szCs w:val="24"/>
-              </w:rPr>
-            </w:pPr>
-            <w:r>
-              <w:rPr>
-                <w:rFonts w:ascii="Times New Roman" w:hAnsi="Times New Roman" w:cs="Times New Roman"/>
-                <w:b/>
-                <w:bCs/>
-                <w:color w:val="000000"/>
-                <w:szCs w:val="24"/>
-              </w:rPr>
-              <w:t>&lt;0.001</w:t>
-            </w:r>
-          </w:p>
-          <w:p>
-            <w:pPr>
-              <w:jc w:val="center"/>
-              <w:rPr>
-                <w:rFonts w:ascii="Times New Roman" w:hAnsi="Times New Roman" w:cs="Times New Roman"/>
-                <w:b/>
-                <w:bCs/>
-                <w:color w:val="000000"/>
-                <w:szCs w:val="24"/>
-              </w:rPr>
-            </w:pPr>
-            <w:r>
-              <w:rPr>
-                <w:rFonts w:ascii="Times New Roman" w:hAnsi="Times New Roman" w:cs="Times New Roman"/>
-                <w:b/>
-                <w:bCs/>
-                <w:color w:val="000000"/>
-                <w:szCs w:val="24"/>
-              </w:rPr>
-              <w:t>0.003</w:t>
-            </w:r>
-          </w:p>
-          <w:p>
-            <w:pPr>
-              <w:jc w:val="center"/>
-              <w:rPr>
-                <w:rFonts w:ascii="Times New Roman" w:hAnsi="Times New Roman" w:cs="Times New Roman"/>
-                <w:b/>
-                <w:bCs/>
-                <w:color w:val="000000"/>
-                <w:szCs w:val="24"/>
-              </w:rPr>
-            </w:pPr>
-            <w:r>
-              <w:rPr>
-                <w:rFonts w:ascii="Times New Roman" w:hAnsi="Times New Roman" w:cs="Times New Roman"/>
-                <w:b/>
-                <w:bCs/>
-                <w:color w:val="000000"/>
-                <w:szCs w:val="24"/>
-              </w:rPr>
-              <w:t>&lt;0.001</w:t>
-            </w:r>
-          </w:p>
-          <w:p>
-            <w:pPr>
-              <w:jc w:val="center"/>
-              <w:rPr>
-                <w:rFonts w:ascii="Times New Roman" w:hAnsi="Times New Roman" w:cs="Times New Roman"/>
-                <w:b/>
-                <w:bCs/>
-                <w:color w:val="000000"/>
-                <w:szCs w:val="24"/>
-              </w:rPr>
-            </w:pPr>
-            <w:r>
-              <w:rPr>
-                <w:rFonts w:ascii="Times New Roman" w:hAnsi="Times New Roman" w:cs="Times New Roman"/>
-                <w:b/>
-                <w:bCs/>
-                <w:color w:val="000000"/>
-                <w:szCs w:val="24"/>
-              </w:rPr>
-              <w:t>&lt;0.001</w:t>
-            </w:r>
-          </w:p>
-          <w:p>
-            <w:pPr>
-              <w:jc w:val="center"/>
-              <w:rPr>
-                <w:rFonts w:ascii="Times New Roman" w:hAnsi="Times New Roman" w:cs="Times New Roman"/>
-                <w:b/>
-                <w:bCs/>
-                <w:color w:val="000000"/>
-                <w:szCs w:val="24"/>
-              </w:rPr>
-            </w:pPr>
-            <w:r>
-              <w:rPr>
-                <w:rFonts w:ascii="Times New Roman" w:hAnsi="Times New Roman" w:cs="Times New Roman"/>
-                <w:b/>
-                <w:bCs/>
-                <w:color w:val="000000"/>
-                <w:szCs w:val="24"/>
-              </w:rPr>
-              <w:t>0.001</w:t>
-            </w:r>
-          </w:p>
-          <w:p>
-            <w:pPr>
-              <w:jc w:val="center"/>
-              <w:rPr>
-                <w:rFonts w:ascii="Times New Roman" w:hAnsi="Times New Roman" w:cs="Times New Roman"/>
-                <w:color w:val="000000"/>
-                <w:szCs w:val="24"/>
-              </w:rPr>
-            </w:pPr>
-            <w:r>
-              <w:rPr>
-                <w:rFonts w:ascii="Times New Roman" w:hAnsi="Times New Roman" w:cs="Times New Roman"/>
-                <w:b/>
-                <w:bCs/>
-                <w:color w:val="000000"/>
-                <w:szCs w:val="24"/>
-              </w:rPr>
-              <w:t>0.001</w:t>
-            </w:r>
-          </w:p>
-        </w:tc>
-        <w:tc>
-          <w:tcPr>
-            <w:tcW w:w="579" w:type="pct"/>
+            <w:tcW w:w="622" w:type="pct"/>
             <w:gridSpan w:val="2"/>
             <w:tcBorders>
               <w:left w:val="nil"/>
@@ -6507,287 +6155,87 @@
                 <w:color w:val="000000"/>
                 <w:szCs w:val="24"/>
               </w:rPr>
-              <w:t>0.921</w:t>
-            </w:r>
-          </w:p>
-          <w:p>
-            <w:pPr>
-              <w:jc w:val="center"/>
-              <w:rPr>
-                <w:rFonts w:ascii="Times New Roman" w:hAnsi="Times New Roman" w:cs="Times New Roman"/>
-                <w:color w:val="000000"/>
-                <w:szCs w:val="24"/>
-              </w:rPr>
-            </w:pPr>
-            <w:r>
-              <w:rPr>
-                <w:rFonts w:ascii="Times New Roman" w:hAnsi="Times New Roman" w:cs="Times New Roman"/>
-                <w:color w:val="000000"/>
-                <w:szCs w:val="24"/>
-              </w:rPr>
-              <w:t>-1.633</w:t>
-            </w:r>
-          </w:p>
-          <w:p>
-            <w:pPr>
-              <w:jc w:val="center"/>
-              <w:rPr>
-                <w:rFonts w:ascii="Times New Roman" w:hAnsi="Times New Roman" w:cs="Times New Roman"/>
-                <w:color w:val="000000"/>
-                <w:szCs w:val="24"/>
-              </w:rPr>
-            </w:pPr>
-            <w:r>
-              <w:rPr>
-                <w:rFonts w:ascii="Times New Roman" w:hAnsi="Times New Roman" w:cs="Times New Roman"/>
-                <w:color w:val="000000"/>
-                <w:szCs w:val="24"/>
-              </w:rPr>
-              <w:t>2.289</w:t>
-            </w:r>
-          </w:p>
-          <w:p>
-            <w:pPr>
-              <w:jc w:val="center"/>
-              <w:rPr>
-                <w:rFonts w:ascii="Times New Roman" w:hAnsi="Times New Roman" w:cs="Times New Roman"/>
-                <w:color w:val="000000"/>
-                <w:szCs w:val="24"/>
-              </w:rPr>
-            </w:pPr>
-            <w:r>
-              <w:rPr>
-                <w:rFonts w:ascii="Times New Roman" w:hAnsi="Times New Roman" w:cs="Times New Roman"/>
-                <w:color w:val="000000"/>
-                <w:szCs w:val="24"/>
-              </w:rPr>
-              <w:t>-1.436</w:t>
-            </w:r>
-          </w:p>
-          <w:p>
-            <w:pPr>
-              <w:jc w:val="center"/>
-              <w:rPr>
-                <w:rFonts w:ascii="Times New Roman" w:hAnsi="Times New Roman" w:cs="Times New Roman"/>
-                <w:color w:val="000000"/>
-                <w:szCs w:val="24"/>
-              </w:rPr>
-            </w:pPr>
-            <w:r>
-              <w:rPr>
-                <w:rFonts w:ascii="Times New Roman" w:hAnsi="Times New Roman" w:cs="Times New Roman"/>
-                <w:color w:val="000000"/>
-                <w:szCs w:val="24"/>
-              </w:rPr>
-              <w:t>-1.843</w:t>
-            </w:r>
-          </w:p>
-          <w:p>
-            <w:pPr>
-              <w:jc w:val="center"/>
-              <w:rPr>
-                <w:rFonts w:ascii="Times New Roman" w:hAnsi="Times New Roman" w:cs="Times New Roman"/>
-                <w:color w:val="000000"/>
-                <w:szCs w:val="24"/>
-              </w:rPr>
-            </w:pPr>
-            <w:r>
-              <w:rPr>
-                <w:rFonts w:ascii="Times New Roman" w:hAnsi="Times New Roman" w:cs="Times New Roman"/>
-                <w:color w:val="000000"/>
-                <w:szCs w:val="24"/>
-              </w:rPr>
-              <w:t>0.232</w:t>
-            </w:r>
-          </w:p>
-          <w:p>
-            <w:pPr>
-              <w:jc w:val="center"/>
-              <w:rPr>
-                <w:rFonts w:ascii="Times New Roman" w:hAnsi="Times New Roman" w:cs="Times New Roman"/>
-                <w:color w:val="000000"/>
-                <w:szCs w:val="24"/>
-              </w:rPr>
-            </w:pPr>
-            <w:r>
-              <w:rPr>
-                <w:rFonts w:ascii="Times New Roman" w:hAnsi="Times New Roman" w:cs="Times New Roman"/>
-                <w:color w:val="000000"/>
-                <w:szCs w:val="24"/>
-              </w:rPr>
-              <w:t>3.569</w:t>
-            </w:r>
-          </w:p>
-          <w:p>
-            <w:pPr>
-              <w:jc w:val="center"/>
-              <w:rPr>
-                <w:rFonts w:ascii="Times New Roman" w:hAnsi="Times New Roman" w:cs="Times New Roman"/>
-                <w:color w:val="000000"/>
-                <w:szCs w:val="24"/>
-              </w:rPr>
-            </w:pPr>
-            <w:r>
-              <w:rPr>
-                <w:rFonts w:ascii="Times New Roman" w:hAnsi="Times New Roman" w:cs="Times New Roman"/>
-                <w:color w:val="000000"/>
-                <w:szCs w:val="24"/>
-              </w:rPr>
-              <w:t>0.608</w:t>
-            </w:r>
-          </w:p>
-          <w:p>
-            <w:pPr>
-              <w:jc w:val="center"/>
-              <w:rPr>
-                <w:rFonts w:ascii="Times New Roman" w:hAnsi="Times New Roman" w:cs="Times New Roman"/>
-                <w:color w:val="000000"/>
-                <w:szCs w:val="24"/>
-              </w:rPr>
-            </w:pPr>
-            <w:r>
-              <w:rPr>
-                <w:rFonts w:ascii="Times New Roman" w:hAnsi="Times New Roman" w:cs="Times New Roman"/>
-                <w:color w:val="000000"/>
-                <w:szCs w:val="24"/>
-              </w:rPr>
-              <w:t>-0.791</w:t>
-            </w:r>
-          </w:p>
-          <w:p>
-            <w:pPr>
-              <w:jc w:val="center"/>
-              <w:rPr>
-                <w:rFonts w:ascii="Times New Roman" w:hAnsi="Times New Roman" w:cs="Times New Roman"/>
-                <w:color w:val="000000"/>
-                <w:szCs w:val="24"/>
-              </w:rPr>
-            </w:pPr>
-            <w:r>
-              <w:rPr>
-                <w:rFonts w:ascii="Times New Roman" w:hAnsi="Times New Roman" w:cs="Times New Roman"/>
-                <w:color w:val="000000"/>
-                <w:szCs w:val="24"/>
-              </w:rPr>
-              <w:t>1.427</w:t>
-            </w:r>
-          </w:p>
-          <w:p>
-            <w:pPr>
-              <w:jc w:val="center"/>
-              <w:rPr>
-                <w:rFonts w:ascii="Times New Roman" w:hAnsi="Times New Roman" w:cs="Times New Roman"/>
-                <w:color w:val="000000"/>
-                <w:szCs w:val="24"/>
-              </w:rPr>
-            </w:pPr>
-            <w:r>
-              <w:rPr>
-                <w:rFonts w:ascii="Times New Roman" w:hAnsi="Times New Roman" w:cs="Times New Roman"/>
-                <w:color w:val="000000"/>
-                <w:szCs w:val="24"/>
-              </w:rPr>
-              <w:t>-0.774</w:t>
-            </w:r>
-          </w:p>
-          <w:p>
-            <w:pPr>
-              <w:jc w:val="center"/>
-              <w:rPr>
-                <w:rFonts w:ascii="Times New Roman" w:hAnsi="Times New Roman" w:cs="Times New Roman"/>
-                <w:color w:val="000000"/>
-                <w:szCs w:val="24"/>
-              </w:rPr>
-            </w:pPr>
-            <w:r>
-              <w:rPr>
-                <w:rFonts w:ascii="Times New Roman" w:hAnsi="Times New Roman" w:cs="Times New Roman"/>
-                <w:color w:val="000000"/>
-                <w:szCs w:val="24"/>
-              </w:rPr>
-              <w:t>1.440</w:t>
-            </w:r>
-          </w:p>
-          <w:p>
-            <w:pPr>
-              <w:jc w:val="center"/>
-              <w:rPr>
-                <w:rFonts w:ascii="Times New Roman" w:hAnsi="Times New Roman" w:cs="Times New Roman"/>
-                <w:color w:val="000000"/>
-                <w:szCs w:val="24"/>
-              </w:rPr>
-            </w:pPr>
-            <w:r>
-              <w:rPr>
-                <w:rFonts w:ascii="Times New Roman" w:hAnsi="Times New Roman" w:cs="Times New Roman"/>
-                <w:color w:val="000000"/>
-                <w:szCs w:val="24"/>
-              </w:rPr>
-              <w:t>-1.711</w:t>
-            </w:r>
-          </w:p>
-          <w:p>
-            <w:pPr>
-              <w:jc w:val="center"/>
-              <w:rPr>
-                <w:rFonts w:ascii="Times New Roman" w:hAnsi="Times New Roman" w:cs="Times New Roman"/>
-                <w:color w:val="000000"/>
-                <w:szCs w:val="24"/>
-              </w:rPr>
-            </w:pPr>
-            <w:r>
-              <w:rPr>
-                <w:rFonts w:ascii="Times New Roman" w:hAnsi="Times New Roman" w:cs="Times New Roman"/>
-                <w:color w:val="000000"/>
-                <w:szCs w:val="24"/>
-              </w:rPr>
-              <w:t>-2.079</w:t>
-            </w:r>
-          </w:p>
-          <w:p>
-            <w:pPr>
-              <w:jc w:val="center"/>
-              <w:rPr>
-                <w:rFonts w:ascii="Times New Roman" w:hAnsi="Times New Roman" w:cs="Times New Roman"/>
-                <w:color w:val="000000"/>
-                <w:szCs w:val="24"/>
-              </w:rPr>
-            </w:pPr>
-            <w:r>
-              <w:rPr>
-                <w:rFonts w:ascii="Times New Roman" w:hAnsi="Times New Roman" w:cs="Times New Roman"/>
-                <w:color w:val="000000"/>
-                <w:szCs w:val="24"/>
-              </w:rPr>
-              <w:t>2.079</w:t>
-            </w:r>
-          </w:p>
-        </w:tc>
-        <w:tc>
-          <w:tcPr>
-            <w:tcW w:w="622" w:type="pct"/>
-            <w:tcBorders>
-              <w:left w:val="nil"/>
-              <w:bottom w:val="single" w:sz="4" w:space="0" w:color="auto"/>
-              <w:right w:val="nil"/>
-            </w:tcBorders>
-          </w:tcPr>
-          <w:p>
-            <w:pPr>
-              <w:jc w:val="center"/>
-              <w:rPr>
-                <w:rFonts w:ascii="Times New Roman" w:hAnsi="Times New Roman" w:cs="Times New Roman"/>
-                <w:color w:val="000000"/>
-                <w:szCs w:val="24"/>
-              </w:rPr>
-            </w:pPr>
-            <w:r>
-              <w:rPr>
-                <w:rFonts w:ascii="Times New Roman" w:hAnsi="Times New Roman" w:cs="Times New Roman"/>
-                <w:color w:val="000000"/>
-                <w:szCs w:val="24"/>
-              </w:rPr>
-              <w:t>0.055</w:t>
+              <w:t>0.844</w:t>
+            </w:r>
+          </w:p>
+          <w:p>
+            <w:pPr>
+              <w:jc w:val="center"/>
+              <w:rPr>
+                <w:rFonts w:ascii="Times New Roman" w:hAnsi="Times New Roman" w:cs="Times New Roman"/>
+                <w:b/>
+                <w:bCs/>
+                <w:color w:val="000000"/>
+                <w:szCs w:val="24"/>
+              </w:rPr>
+            </w:pPr>
+            <w:r>
+              <w:rPr>
+                <w:rFonts w:ascii="Times New Roman" w:hAnsi="Times New Roman" w:cs="Times New Roman"/>
+                <w:b/>
+                <w:bCs/>
+                <w:color w:val="000000"/>
+                <w:szCs w:val="24"/>
+              </w:rPr>
+              <w:t>0.016</w:t>
+            </w:r>
+          </w:p>
+          <w:p>
+            <w:pPr>
+              <w:jc w:val="center"/>
+              <w:rPr>
+                <w:rFonts w:ascii="Times New Roman" w:hAnsi="Times New Roman" w:cs="Times New Roman"/>
+                <w:b/>
+                <w:bCs/>
+                <w:color w:val="000000"/>
+                <w:szCs w:val="24"/>
+              </w:rPr>
+            </w:pPr>
+            <w:r>
+              <w:rPr>
+                <w:rFonts w:ascii="Times New Roman" w:hAnsi="Times New Roman" w:cs="Times New Roman"/>
+                <w:b/>
+                <w:bCs/>
+                <w:color w:val="000000"/>
+                <w:szCs w:val="24"/>
+              </w:rPr>
+              <w:t>0.016</w:t>
+            </w:r>
+          </w:p>
+          <w:p>
+            <w:pPr>
+              <w:jc w:val="center"/>
+              <w:rPr>
+                <w:rFonts w:ascii="Times New Roman" w:hAnsi="Times New Roman" w:cs="Times New Roman"/>
+                <w:color w:val="000000"/>
+                <w:szCs w:val="24"/>
+              </w:rPr>
+            </w:pPr>
+            <w:r>
+              <w:rPr>
+                <w:rFonts w:ascii="Times New Roman" w:hAnsi="Times New Roman" w:cs="Times New Roman"/>
+                <w:color w:val="000000"/>
+                <w:szCs w:val="24"/>
+              </w:rPr>
+              <w:t>0.25</w:t>
+            </w:r>
+          </w:p>
+          <w:p>
+            <w:pPr>
+              <w:jc w:val="center"/>
+              <w:rPr>
+                <w:rFonts w:ascii="Times New Roman" w:hAnsi="Times New Roman" w:cs="Times New Roman"/>
+                <w:color w:val="000000"/>
+                <w:szCs w:val="24"/>
+              </w:rPr>
+            </w:pPr>
+            <w:r>
+              <w:rPr>
+                <w:rFonts w:ascii="Times New Roman" w:hAnsi="Times New Roman" w:cs="Times New Roman"/>
+                <w:color w:val="000000"/>
+                <w:szCs w:val="24"/>
+              </w:rPr>
+              <w:t>0.0547</w:t>
             </w:r>
           </w:p>
           <w:p>
@@ -6831,6 +6279,64 @@
                 <w:color w:val="000000"/>
                 <w:szCs w:val="24"/>
               </w:rPr>
+              <w:t>0.039</w:t>
+            </w:r>
+          </w:p>
+          <w:p>
+            <w:pPr>
+              <w:jc w:val="center"/>
+              <w:rPr>
+                <w:rFonts w:ascii="Times New Roman" w:hAnsi="Times New Roman" w:cs="Times New Roman"/>
+                <w:color w:val="000000"/>
+                <w:szCs w:val="24"/>
+              </w:rPr>
+            </w:pPr>
+            <w:r>
+              <w:rPr>
+                <w:rFonts w:ascii="Times New Roman" w:hAnsi="Times New Roman" w:cs="Times New Roman"/>
+                <w:color w:val="000000"/>
+                <w:szCs w:val="24"/>
+              </w:rPr>
+              <w:t>0.945</w:t>
+            </w:r>
+          </w:p>
+          <w:p>
+            <w:pPr>
+              <w:jc w:val="center"/>
+              <w:rPr>
+                <w:rFonts w:ascii="Times New Roman" w:hAnsi="Times New Roman" w:cs="Times New Roman"/>
+                <w:color w:val="000000"/>
+                <w:szCs w:val="24"/>
+              </w:rPr>
+            </w:pPr>
+            <w:r>
+              <w:rPr>
+                <w:rFonts w:ascii="Times New Roman" w:hAnsi="Times New Roman" w:cs="Times New Roman"/>
+                <w:color w:val="000000"/>
+                <w:szCs w:val="24"/>
+              </w:rPr>
+              <w:t>0.742</w:t>
+            </w:r>
+          </w:p>
+          <w:p>
+            <w:pPr>
+              <w:jc w:val="center"/>
+              <w:rPr>
+                <w:rFonts w:ascii="Times New Roman" w:hAnsi="Times New Roman" w:cs="Times New Roman"/>
+                <w:b/>
+                <w:bCs/>
+                <w:color w:val="000000"/>
+                <w:szCs w:val="24"/>
+              </w:rPr>
+            </w:pPr>
+            <w:r>
+              <w:rPr>
+                <w:rFonts w:ascii="Times New Roman" w:hAnsi="Times New Roman" w:cs="Times New Roman"/>
+                <w:b/>
+                <w:bCs/>
+                <w:color w:val="000000"/>
+                <w:szCs w:val="24"/>
+              </w:rPr>
               <w:t>0.008</w:t>
             </w:r>
           </w:p>
@@ -6890,26 +6396,6 @@
             <w:r>
               <w:rPr>
                 <w:rFonts w:ascii="Times New Roman" w:hAnsi="Times New Roman" w:cs="Times New Roman"/>
-                <w:color w:val="000000"/>
-                <w:szCs w:val="24"/>
-              </w:rPr>
-              <w:t>0.844</w:t>
-            </w:r>
-          </w:p>
-          <w:p>
-            <w:pPr>
-              <w:jc w:val="center"/>
-              <w:rPr>
-                <w:rFonts w:ascii="Times New Roman" w:hAnsi="Times New Roman" w:cs="Times New Roman"/>
-                <w:b/>
-                <w:bCs/>
-                <w:color w:val="000000"/>
-                <w:szCs w:val="24"/>
-              </w:rPr>
-            </w:pPr>
-            <w:r>
-              <w:rPr>
-                <w:rFonts w:ascii="Times New Roman" w:hAnsi="Times New Roman" w:cs="Times New Roman"/>
                 <w:b/>
                 <w:bCs/>
                 <w:color w:val="000000"/>
@@ -6933,155 +6419,25 @@
                 <w:color w:val="000000"/>
                 <w:szCs w:val="24"/>
               </w:rPr>
-              <w:t>0.109</w:t>
-            </w:r>
-          </w:p>
-          <w:p>
-            <w:pPr>
-              <w:jc w:val="center"/>
-              <w:rPr>
-                <w:rFonts w:ascii="Times New Roman" w:hAnsi="Times New Roman" w:cs="Times New Roman"/>
-                <w:b/>
-                <w:bCs/>
-                <w:color w:val="000000"/>
-                <w:szCs w:val="24"/>
-              </w:rPr>
-            </w:pPr>
-            <w:r>
-              <w:rPr>
-                <w:rFonts w:ascii="Times New Roman" w:hAnsi="Times New Roman" w:cs="Times New Roman"/>
-                <w:b/>
-                <w:bCs/>
-                <w:color w:val="000000"/>
-                <w:szCs w:val="24"/>
-              </w:rPr>
-              <w:t>0.016</w:t>
-            </w:r>
-          </w:p>
-          <w:p>
-            <w:pPr>
-              <w:jc w:val="center"/>
-              <w:rPr>
-                <w:rFonts w:ascii="Times New Roman" w:hAnsi="Times New Roman" w:cs="Times New Roman"/>
-                <w:b/>
-                <w:bCs/>
-                <w:color w:val="000000"/>
-                <w:szCs w:val="24"/>
-              </w:rPr>
-            </w:pPr>
-            <w:r>
-              <w:rPr>
-                <w:rFonts w:ascii="Times New Roman" w:hAnsi="Times New Roman" w:cs="Times New Roman"/>
-                <w:b/>
-                <w:bCs/>
-                <w:color w:val="000000"/>
-                <w:szCs w:val="24"/>
-              </w:rPr>
-              <w:t>0.016</w:t>
-            </w:r>
-          </w:p>
-          <w:p>
-            <w:pPr>
-              <w:jc w:val="center"/>
-              <w:rPr>
-                <w:rFonts w:ascii="Times New Roman" w:hAnsi="Times New Roman" w:cs="Times New Roman"/>
-                <w:color w:val="000000"/>
-                <w:szCs w:val="24"/>
-              </w:rPr>
-            </w:pPr>
-            <w:r>
-              <w:rPr>
-                <w:rFonts w:ascii="Times New Roman" w:hAnsi="Times New Roman" w:cs="Times New Roman"/>
-                <w:color w:val="000000"/>
-                <w:szCs w:val="24"/>
-              </w:rPr>
-              <w:t>0.195</w:t>
-            </w:r>
-          </w:p>
-          <w:p>
-            <w:pPr>
-              <w:jc w:val="center"/>
-              <w:rPr>
-                <w:rFonts w:ascii="Times New Roman" w:hAnsi="Times New Roman" w:cs="Times New Roman"/>
-                <w:b/>
-                <w:bCs/>
-                <w:color w:val="000000"/>
-                <w:szCs w:val="24"/>
-              </w:rPr>
-            </w:pPr>
-            <w:r>
-              <w:rPr>
-                <w:rFonts w:ascii="Times New Roman" w:hAnsi="Times New Roman" w:cs="Times New Roman"/>
-                <w:b/>
-                <w:bCs/>
-                <w:color w:val="000000"/>
-                <w:szCs w:val="24"/>
-              </w:rPr>
-              <w:t>0.023</w:t>
-            </w:r>
-          </w:p>
-          <w:p>
-            <w:pPr>
-              <w:jc w:val="center"/>
-              <w:rPr>
-                <w:rFonts w:ascii="Times New Roman" w:hAnsi="Times New Roman" w:cs="Times New Roman"/>
-                <w:b/>
-                <w:bCs/>
-                <w:color w:val="000000"/>
-                <w:szCs w:val="24"/>
-              </w:rPr>
-            </w:pPr>
-            <w:r>
-              <w:rPr>
-                <w:rFonts w:ascii="Times New Roman" w:hAnsi="Times New Roman" w:cs="Times New Roman"/>
-                <w:b/>
-                <w:bCs/>
-                <w:color w:val="000000"/>
-                <w:szCs w:val="24"/>
-              </w:rPr>
-              <w:t>0.008</w:t>
-            </w:r>
-          </w:p>
-          <w:p>
-            <w:pPr>
-              <w:jc w:val="center"/>
-              <w:rPr>
-                <w:rFonts w:ascii="Times New Roman" w:hAnsi="Times New Roman" w:cs="Times New Roman"/>
-                <w:b/>
-                <w:bCs/>
-                <w:color w:val="000000"/>
-                <w:szCs w:val="24"/>
-              </w:rPr>
-            </w:pPr>
-            <w:r>
-              <w:rPr>
-                <w:rFonts w:ascii="Times New Roman" w:hAnsi="Times New Roman" w:cs="Times New Roman"/>
-                <w:b/>
-                <w:bCs/>
-                <w:color w:val="000000"/>
-                <w:szCs w:val="24"/>
-              </w:rPr>
-              <w:t>0.008</w:t>
-            </w:r>
-          </w:p>
-          <w:p>
-            <w:pPr>
-              <w:jc w:val="center"/>
-              <w:rPr>
-                <w:rFonts w:ascii="Times New Roman" w:hAnsi="Times New Roman" w:cs="Times New Roman"/>
-                <w:color w:val="000000"/>
-                <w:szCs w:val="24"/>
-              </w:rPr>
-            </w:pPr>
-            <w:r>
-              <w:rPr>
-                <w:rFonts w:ascii="Times New Roman" w:hAnsi="Times New Roman" w:cs="Times New Roman"/>
-                <w:b/>
-                <w:bCs/>
-                <w:color w:val="000000"/>
-                <w:szCs w:val="24"/>
-              </w:rPr>
-              <w:t>0.008</w:t>
+              <w:t>0.313</w:t>
+            </w:r>
+          </w:p>
+          <w:p>
+            <w:pPr>
+              <w:jc w:val="center"/>
+              <w:rPr>
+                <w:rFonts w:ascii="Times New Roman" w:hAnsi="Times New Roman" w:cs="Times New Roman"/>
+                <w:color w:val="000000"/>
+                <w:szCs w:val="24"/>
+              </w:rPr>
+            </w:pPr>
+            <w:r>
+              <w:rPr>
+                <w:rFonts w:ascii="Times New Roman" w:hAnsi="Times New Roman" w:cs="Times New Roman"/>
+                <w:color w:val="000000"/>
+                <w:szCs w:val="24"/>
+              </w:rPr>
+              <w:t>0.313</w:t>
             </w:r>
           </w:p>
         </w:tc>
@@ -7092,7 +6448,7 @@
         </w:trPr>
         <w:tc>
           <w:tcPr>
-            <w:tcW w:w="106" w:type="pct"/>
+            <w:tcW w:w="108" w:type="pct"/>
             <w:tcBorders>
               <w:left w:val="nil"/>
               <w:bottom w:val="nil"/>
@@ -7111,8 +6467,8 @@
         </w:tc>
         <w:tc>
           <w:tcPr>
-            <w:tcW w:w="4894" w:type="pct"/>
-            <w:gridSpan w:val="11"/>
+            <w:tcW w:w="4892" w:type="pct"/>
+            <w:gridSpan w:val="9"/>
             <w:tcBorders>
               <w:left w:val="nil"/>
               <w:bottom w:val="nil"/>
@@ -7234,6 +6590,2138 @@
         </w:rPr>
       </w:pPr>
     </w:p>
+    <w:tbl>
+      <w:tblPr>
+        <w:tblW w:w="5934" w:type="pct"/>
+        <w:tblInd w:w="-360" w:type="dxa"/>
+        <w:tblBorders>
+          <w:top w:val="single" w:sz="4" w:space="0" w:color="auto"/>
+          <w:left w:val="single" w:sz="4" w:space="0" w:color="auto"/>
+          <w:bottom w:val="single" w:sz="4" w:space="0" w:color="auto"/>
+          <w:right w:val="single" w:sz="4" w:space="0" w:color="auto"/>
+          <w:insideH w:val="single" w:sz="4" w:space="0" w:color="auto"/>
+          <w:insideV w:val="single" w:sz="4" w:space="0" w:color="auto"/>
+        </w:tblBorders>
+        <w:tblLayout w:type="fixed"/>
+        <w:tblLook w:val="0000" w:firstRow="0" w:lastRow="0" w:firstColumn="0" w:lastColumn="0" w:noHBand="0" w:noVBand="0"/>
+      </w:tblPr>
+      <w:tblGrid>
+        <w:gridCol w:w="239"/>
+        <w:gridCol w:w="1295"/>
+        <w:gridCol w:w="1724"/>
+        <w:gridCol w:w="1286"/>
+        <w:gridCol w:w="1286"/>
+        <w:gridCol w:w="104"/>
+        <w:gridCol w:w="1182"/>
+        <w:gridCol w:w="1382"/>
+        <w:gridCol w:w="60"/>
+        <w:gridCol w:w="2550"/>
+      </w:tblGrid>
+      <w:tr>
+        <w:trPr>
+          <w:gridAfter w:val="1"/>
+          <w:wAfter w:w="1148" w:type="pct"/>
+          <w:trHeight w:val="98"/>
+        </w:trPr>
+        <w:tc>
+          <w:tcPr>
+            <w:tcW w:w="690" w:type="pct"/>
+            <w:gridSpan w:val="2"/>
+            <w:vMerge w:val="restart"/>
+            <w:tcBorders>
+              <w:left w:val="nil"/>
+              <w:right w:val="nil"/>
+            </w:tcBorders>
+            <w:vAlign w:val="bottom"/>
+          </w:tcPr>
+          <w:p>
+            <w:pPr>
+              <w:jc w:val="center"/>
+              <w:rPr>
+                <w:rFonts w:ascii="Times New Roman" w:hAnsi="Times New Roman" w:cs="Times New Roman"/>
+                <w:i/>
+                <w:iCs/>
+                <w:szCs w:val="24"/>
+              </w:rPr>
+            </w:pPr>
+            <w:r>
+              <w:rPr>
+                <w:rFonts w:ascii="Times New Roman" w:hAnsi="Times New Roman" w:cs="Times New Roman"/>
+                <w:i/>
+                <w:iCs/>
+                <w:szCs w:val="24"/>
+              </w:rPr>
+              <w:t>Trait</w:t>
+            </w:r>
+          </w:p>
+        </w:tc>
+        <w:tc>
+          <w:tcPr>
+            <w:tcW w:w="776" w:type="pct"/>
+            <w:vMerge w:val="restart"/>
+            <w:tcBorders>
+              <w:left w:val="nil"/>
+              <w:right w:val="nil"/>
+            </w:tcBorders>
+            <w:vAlign w:val="bottom"/>
+          </w:tcPr>
+          <w:p>
+            <w:pPr>
+              <w:jc w:val="center"/>
+              <w:rPr>
+                <w:rFonts w:ascii="Times New Roman" w:hAnsi="Times New Roman" w:cs="Times New Roman"/>
+                <w:i/>
+                <w:iCs/>
+                <w:szCs w:val="24"/>
+              </w:rPr>
+            </w:pPr>
+            <w:r>
+              <w:rPr>
+                <w:rFonts w:ascii="Times New Roman" w:hAnsi="Times New Roman" w:cs="Times New Roman"/>
+                <w:i/>
+                <w:iCs/>
+                <w:szCs w:val="24"/>
+              </w:rPr>
+              <w:t>Category</w:t>
+            </w:r>
+          </w:p>
+        </w:tc>
+        <w:tc>
+          <w:tcPr>
+            <w:tcW w:w="1205" w:type="pct"/>
+            <w:gridSpan w:val="3"/>
+            <w:tcBorders>
+              <w:left w:val="nil"/>
+              <w:bottom w:val="single" w:sz="4" w:space="0" w:color="auto"/>
+              <w:right w:val="nil"/>
+            </w:tcBorders>
+            <w:vAlign w:val="bottom"/>
+          </w:tcPr>
+          <w:p>
+            <w:pPr>
+              <w:jc w:val="center"/>
+              <w:rPr>
+                <w:rFonts w:ascii="Times New Roman" w:hAnsi="Times New Roman" w:cs="Times New Roman"/>
+                <w:i/>
+                <w:iCs/>
+                <w:szCs w:val="24"/>
+              </w:rPr>
+            </w:pPr>
+            <w:r>
+              <w:rPr>
+                <w:rFonts w:ascii="Times New Roman" w:hAnsi="Times New Roman" w:cs="Times New Roman"/>
+                <w:i/>
+                <w:iCs/>
+                <w:szCs w:val="24"/>
+              </w:rPr>
+              <w:t>Vacant Lots</w:t>
+            </w:r>
+          </w:p>
+        </w:tc>
+        <w:tc>
+          <w:tcPr>
+            <w:tcW w:w="1181" w:type="pct"/>
+            <w:gridSpan w:val="3"/>
+            <w:tcBorders>
+              <w:left w:val="nil"/>
+              <w:bottom w:val="single" w:sz="4" w:space="0" w:color="auto"/>
+              <w:right w:val="nil"/>
+            </w:tcBorders>
+            <w:vAlign w:val="bottom"/>
+          </w:tcPr>
+          <w:p>
+            <w:pPr>
+              <w:jc w:val="center"/>
+              <w:rPr>
+                <w:rFonts w:ascii="Times New Roman" w:hAnsi="Times New Roman" w:cs="Times New Roman"/>
+                <w:i/>
+                <w:iCs/>
+                <w:szCs w:val="24"/>
+              </w:rPr>
+            </w:pPr>
+            <w:r>
+              <w:rPr>
+                <w:rFonts w:ascii="Times New Roman" w:hAnsi="Times New Roman" w:cs="Times New Roman"/>
+                <w:i/>
+                <w:iCs/>
+                <w:szCs w:val="24"/>
+              </w:rPr>
+              <w:t>High Diversity Prairies</w:t>
+            </w:r>
+          </w:p>
+        </w:tc>
+      </w:tr>
+      <w:tr>
+        <w:trPr>
+          <w:gridAfter w:val="2"/>
+          <w:wAfter w:w="1175" w:type="pct"/>
+          <w:trHeight w:val="345"/>
+        </w:trPr>
+        <w:tc>
+          <w:tcPr>
+            <w:tcW w:w="690" w:type="pct"/>
+            <w:gridSpan w:val="2"/>
+            <w:vMerge/>
+            <w:tcBorders>
+              <w:left w:val="nil"/>
+              <w:bottom w:val="single" w:sz="4" w:space="0" w:color="auto"/>
+              <w:right w:val="nil"/>
+            </w:tcBorders>
+          </w:tcPr>
+          <w:p>
+            <w:pPr>
+              <w:rPr>
+                <w:rFonts w:ascii="Times New Roman" w:hAnsi="Times New Roman" w:cs="Times New Roman"/>
+                <w:i/>
+                <w:iCs/>
+                <w:szCs w:val="24"/>
+              </w:rPr>
+            </w:pPr>
+          </w:p>
+        </w:tc>
+        <w:tc>
+          <w:tcPr>
+            <w:tcW w:w="776" w:type="pct"/>
+            <w:vMerge/>
+            <w:tcBorders>
+              <w:left w:val="nil"/>
+              <w:bottom w:val="single" w:sz="4" w:space="0" w:color="auto"/>
+              <w:right w:val="nil"/>
+            </w:tcBorders>
+            <w:vAlign w:val="bottom"/>
+          </w:tcPr>
+          <w:p>
+            <w:pPr>
+              <w:jc w:val="center"/>
+              <w:rPr>
+                <w:rFonts w:ascii="Times New Roman" w:hAnsi="Times New Roman" w:cs="Times New Roman"/>
+                <w:i/>
+                <w:iCs/>
+                <w:szCs w:val="24"/>
+              </w:rPr>
+            </w:pPr>
+          </w:p>
+        </w:tc>
+        <w:tc>
+          <w:tcPr>
+            <w:tcW w:w="579" w:type="pct"/>
+            <w:tcBorders>
+              <w:left w:val="nil"/>
+              <w:bottom w:val="single" w:sz="4" w:space="0" w:color="auto"/>
+              <w:right w:val="nil"/>
+            </w:tcBorders>
+          </w:tcPr>
+          <w:p>
+            <w:pPr>
+              <w:jc w:val="center"/>
+              <w:rPr>
+                <w:rFonts w:ascii="Times New Roman" w:hAnsi="Times New Roman" w:cs="Times New Roman"/>
+                <w:i/>
+                <w:iCs/>
+                <w:szCs w:val="24"/>
+              </w:rPr>
+            </w:pPr>
+            <w:r>
+              <w:rPr>
+                <w:rFonts w:ascii="Times New Roman" w:hAnsi="Times New Roman" w:cs="Times New Roman"/>
+                <w:i/>
+                <w:iCs/>
+                <w:szCs w:val="24"/>
+              </w:rPr>
+              <w:t>SES</w:t>
+            </w:r>
+          </w:p>
+        </w:tc>
+        <w:tc>
+          <w:tcPr>
+            <w:tcW w:w="579" w:type="pct"/>
+            <w:tcBorders>
+              <w:left w:val="nil"/>
+              <w:bottom w:val="single" w:sz="4" w:space="0" w:color="auto"/>
+              <w:right w:val="nil"/>
+            </w:tcBorders>
+          </w:tcPr>
+          <w:p>
+            <w:pPr>
+              <w:jc w:val="center"/>
+              <w:rPr>
+                <w:rFonts w:ascii="Times New Roman" w:hAnsi="Times New Roman" w:cs="Times New Roman"/>
+                <w:i/>
+                <w:iCs/>
+                <w:szCs w:val="24"/>
+              </w:rPr>
+            </w:pPr>
+            <w:r>
+              <w:rPr>
+                <w:rFonts w:ascii="Times New Roman" w:hAnsi="Times New Roman" w:cs="Times New Roman"/>
+                <w:i/>
+                <w:iCs/>
+                <w:szCs w:val="24"/>
+              </w:rPr>
+              <w:t>p-value</w:t>
+            </w:r>
+          </w:p>
+        </w:tc>
+        <w:tc>
+          <w:tcPr>
+            <w:tcW w:w="579" w:type="pct"/>
+            <w:gridSpan w:val="2"/>
+            <w:tcBorders>
+              <w:left w:val="nil"/>
+              <w:bottom w:val="single" w:sz="4" w:space="0" w:color="auto"/>
+              <w:right w:val="nil"/>
+            </w:tcBorders>
+            <w:vAlign w:val="bottom"/>
+          </w:tcPr>
+          <w:p>
+            <w:pPr>
+              <w:jc w:val="center"/>
+              <w:rPr>
+                <w:rFonts w:ascii="Times New Roman" w:hAnsi="Times New Roman" w:cs="Times New Roman"/>
+                <w:i/>
+                <w:iCs/>
+                <w:szCs w:val="24"/>
+              </w:rPr>
+            </w:pPr>
+            <w:r>
+              <w:rPr>
+                <w:rFonts w:ascii="Times New Roman" w:hAnsi="Times New Roman" w:cs="Times New Roman"/>
+                <w:i/>
+                <w:iCs/>
+                <w:szCs w:val="24"/>
+              </w:rPr>
+              <w:t>SES</w:t>
+            </w:r>
+          </w:p>
+        </w:tc>
+        <w:tc>
+          <w:tcPr>
+            <w:tcW w:w="622" w:type="pct"/>
+            <w:tcBorders>
+              <w:left w:val="nil"/>
+              <w:bottom w:val="single" w:sz="4" w:space="0" w:color="auto"/>
+              <w:right w:val="nil"/>
+            </w:tcBorders>
+            <w:vAlign w:val="bottom"/>
+          </w:tcPr>
+          <w:p>
+            <w:pPr>
+              <w:jc w:val="center"/>
+              <w:rPr>
+                <w:rFonts w:ascii="Times New Roman" w:hAnsi="Times New Roman" w:cs="Times New Roman"/>
+                <w:i/>
+                <w:iCs/>
+                <w:szCs w:val="24"/>
+              </w:rPr>
+            </w:pPr>
+            <w:r>
+              <w:rPr>
+                <w:rFonts w:ascii="Times New Roman" w:hAnsi="Times New Roman" w:cs="Times New Roman"/>
+                <w:i/>
+                <w:iCs/>
+                <w:szCs w:val="24"/>
+              </w:rPr>
+              <w:t>p-value</w:t>
+            </w:r>
+          </w:p>
+        </w:tc>
+      </w:tr>
+      <w:tr>
+        <w:trPr>
+          <w:gridAfter w:val="2"/>
+          <w:wAfter w:w="1175" w:type="pct"/>
+          <w:trHeight w:val="96"/>
+        </w:trPr>
+        <w:tc>
+          <w:tcPr>
+            <w:tcW w:w="690" w:type="pct"/>
+            <w:gridSpan w:val="2"/>
+            <w:tcBorders>
+              <w:left w:val="nil"/>
+              <w:bottom w:val="single" w:sz="4" w:space="0" w:color="auto"/>
+              <w:right w:val="nil"/>
+            </w:tcBorders>
+          </w:tcPr>
+          <w:p>
+            <w:pPr>
+              <w:rPr>
+                <w:rFonts w:ascii="Times New Roman" w:hAnsi="Times New Roman" w:cs="Times New Roman"/>
+                <w:szCs w:val="24"/>
+              </w:rPr>
+            </w:pPr>
+            <w:r>
+              <w:rPr>
+                <w:rFonts w:ascii="Times New Roman" w:hAnsi="Times New Roman" w:cs="Times New Roman"/>
+                <w:szCs w:val="24"/>
+              </w:rPr>
+              <w:t>Body Length</w:t>
+            </w:r>
+          </w:p>
+          <w:p>
+            <w:pPr>
+              <w:rPr>
+                <w:rFonts w:ascii="Times New Roman" w:hAnsi="Times New Roman" w:cs="Times New Roman"/>
+                <w:szCs w:val="24"/>
+              </w:rPr>
+            </w:pPr>
+            <w:proofErr w:type="spellStart"/>
+            <w:r>
+              <w:rPr>
+                <w:rFonts w:ascii="Times New Roman" w:hAnsi="Times New Roman" w:cs="Times New Roman"/>
+                <w:szCs w:val="24"/>
+              </w:rPr>
+              <w:t>Lecty</w:t>
+            </w:r>
+            <w:proofErr w:type="spellEnd"/>
+          </w:p>
+          <w:p>
+            <w:pPr>
+              <w:rPr>
+                <w:rFonts w:ascii="Times New Roman" w:hAnsi="Times New Roman" w:cs="Times New Roman"/>
+                <w:szCs w:val="24"/>
+              </w:rPr>
+            </w:pPr>
+            <w:r>
+              <w:rPr>
+                <w:rFonts w:ascii="Times New Roman" w:hAnsi="Times New Roman" w:cs="Times New Roman"/>
+                <w:szCs w:val="24"/>
+              </w:rPr>
+              <w:t xml:space="preserve">     </w:t>
+            </w:r>
+          </w:p>
+          <w:p>
+            <w:pPr>
+              <w:rPr>
+                <w:rFonts w:ascii="Times New Roman" w:hAnsi="Times New Roman" w:cs="Times New Roman"/>
+                <w:szCs w:val="24"/>
+              </w:rPr>
+            </w:pPr>
+            <w:r>
+              <w:rPr>
+                <w:rFonts w:ascii="Times New Roman" w:hAnsi="Times New Roman" w:cs="Times New Roman"/>
+                <w:szCs w:val="24"/>
+              </w:rPr>
+              <w:t xml:space="preserve">     </w:t>
+            </w:r>
+          </w:p>
+          <w:p>
+            <w:pPr>
+              <w:rPr>
+                <w:rFonts w:ascii="Times New Roman" w:hAnsi="Times New Roman" w:cs="Times New Roman"/>
+                <w:szCs w:val="24"/>
+              </w:rPr>
+            </w:pPr>
+            <w:r>
+              <w:rPr>
+                <w:rFonts w:ascii="Times New Roman" w:hAnsi="Times New Roman" w:cs="Times New Roman"/>
+                <w:szCs w:val="24"/>
+              </w:rPr>
+              <w:t>Nesting type</w:t>
+            </w:r>
+          </w:p>
+          <w:p>
+            <w:pPr>
+              <w:rPr>
+                <w:rFonts w:ascii="Times New Roman" w:hAnsi="Times New Roman" w:cs="Times New Roman"/>
+                <w:szCs w:val="24"/>
+              </w:rPr>
+            </w:pPr>
+          </w:p>
+          <w:p>
+            <w:pPr>
+              <w:rPr>
+                <w:rFonts w:ascii="Times New Roman" w:hAnsi="Times New Roman" w:cs="Times New Roman"/>
+                <w:szCs w:val="24"/>
+              </w:rPr>
+            </w:pPr>
+          </w:p>
+          <w:p>
+            <w:pPr>
+              <w:rPr>
+                <w:rFonts w:ascii="Times New Roman" w:hAnsi="Times New Roman" w:cs="Times New Roman"/>
+                <w:szCs w:val="24"/>
+              </w:rPr>
+            </w:pPr>
+          </w:p>
+          <w:p>
+            <w:pPr>
+              <w:rPr>
+                <w:rFonts w:ascii="Times New Roman" w:hAnsi="Times New Roman" w:cs="Times New Roman"/>
+                <w:szCs w:val="24"/>
+              </w:rPr>
+            </w:pPr>
+          </w:p>
+          <w:p>
+            <w:pPr>
+              <w:rPr>
+                <w:rFonts w:ascii="Times New Roman" w:hAnsi="Times New Roman" w:cs="Times New Roman"/>
+                <w:szCs w:val="24"/>
+              </w:rPr>
+            </w:pPr>
+            <w:r>
+              <w:rPr>
+                <w:rFonts w:ascii="Times New Roman" w:hAnsi="Times New Roman" w:cs="Times New Roman"/>
+                <w:szCs w:val="24"/>
+              </w:rPr>
+              <w:t>Sociality</w:t>
+            </w:r>
+          </w:p>
+          <w:p>
+            <w:pPr>
+              <w:rPr>
+                <w:rFonts w:ascii="Times New Roman" w:hAnsi="Times New Roman" w:cs="Times New Roman"/>
+                <w:szCs w:val="24"/>
+              </w:rPr>
+            </w:pPr>
+          </w:p>
+          <w:p>
+            <w:pPr>
+              <w:rPr>
+                <w:rFonts w:ascii="Times New Roman" w:hAnsi="Times New Roman" w:cs="Times New Roman"/>
+                <w:szCs w:val="24"/>
+              </w:rPr>
+            </w:pPr>
+          </w:p>
+          <w:p>
+            <w:pPr>
+              <w:rPr>
+                <w:rFonts w:ascii="Times New Roman" w:hAnsi="Times New Roman" w:cs="Times New Roman"/>
+                <w:szCs w:val="24"/>
+              </w:rPr>
+            </w:pPr>
+          </w:p>
+          <w:p>
+            <w:pPr>
+              <w:rPr>
+                <w:rFonts w:ascii="Times New Roman" w:hAnsi="Times New Roman" w:cs="Times New Roman"/>
+                <w:szCs w:val="24"/>
+              </w:rPr>
+            </w:pPr>
+            <w:r>
+              <w:rPr>
+                <w:rFonts w:ascii="Times New Roman" w:hAnsi="Times New Roman" w:cs="Times New Roman"/>
+                <w:szCs w:val="24"/>
+              </w:rPr>
+              <w:t>Origin</w:t>
+            </w:r>
+          </w:p>
+        </w:tc>
+        <w:tc>
+          <w:tcPr>
+            <w:tcW w:w="776" w:type="pct"/>
+            <w:tcBorders>
+              <w:left w:val="nil"/>
+              <w:bottom w:val="single" w:sz="4" w:space="0" w:color="auto"/>
+              <w:right w:val="nil"/>
+            </w:tcBorders>
+          </w:tcPr>
+          <w:p>
+            <w:pPr>
+              <w:jc w:val="center"/>
+              <w:rPr>
+                <w:rFonts w:ascii="Times New Roman" w:hAnsi="Times New Roman" w:cs="Times New Roman"/>
+                <w:color w:val="000000"/>
+                <w:szCs w:val="24"/>
+              </w:rPr>
+            </w:pPr>
+          </w:p>
+          <w:p>
+            <w:pPr>
+              <w:jc w:val="center"/>
+              <w:rPr>
+                <w:rFonts w:ascii="Times New Roman" w:hAnsi="Times New Roman" w:cs="Times New Roman"/>
+                <w:color w:val="000000"/>
+                <w:szCs w:val="24"/>
+              </w:rPr>
+            </w:pPr>
+            <w:proofErr w:type="spellStart"/>
+            <w:r>
+              <w:rPr>
+                <w:rFonts w:ascii="Times New Roman" w:hAnsi="Times New Roman" w:cs="Times New Roman"/>
+                <w:color w:val="000000"/>
+                <w:szCs w:val="24"/>
+              </w:rPr>
+              <w:t>Kleptoparasitic</w:t>
+            </w:r>
+            <w:proofErr w:type="spellEnd"/>
+          </w:p>
+          <w:p>
+            <w:pPr>
+              <w:jc w:val="center"/>
+              <w:rPr>
+                <w:rFonts w:ascii="Times New Roman" w:hAnsi="Times New Roman" w:cs="Times New Roman"/>
+                <w:color w:val="000000"/>
+                <w:szCs w:val="24"/>
+              </w:rPr>
+            </w:pPr>
+            <w:r>
+              <w:rPr>
+                <w:rFonts w:ascii="Times New Roman" w:hAnsi="Times New Roman" w:cs="Times New Roman"/>
+                <w:color w:val="000000"/>
+                <w:szCs w:val="24"/>
+              </w:rPr>
+              <w:t>Generalist</w:t>
+            </w:r>
+          </w:p>
+          <w:p>
+            <w:pPr>
+              <w:jc w:val="center"/>
+              <w:rPr>
+                <w:rFonts w:ascii="Times New Roman" w:hAnsi="Times New Roman" w:cs="Times New Roman"/>
+                <w:color w:val="000000"/>
+                <w:szCs w:val="24"/>
+              </w:rPr>
+            </w:pPr>
+            <w:r>
+              <w:rPr>
+                <w:rFonts w:ascii="Times New Roman" w:hAnsi="Times New Roman" w:cs="Times New Roman"/>
+                <w:color w:val="000000"/>
+                <w:szCs w:val="24"/>
+              </w:rPr>
+              <w:t>Specialist</w:t>
+            </w:r>
+          </w:p>
+          <w:p>
+            <w:pPr>
+              <w:jc w:val="center"/>
+              <w:rPr>
+                <w:rFonts w:ascii="Times New Roman" w:hAnsi="Times New Roman" w:cs="Times New Roman"/>
+                <w:color w:val="000000"/>
+                <w:szCs w:val="24"/>
+              </w:rPr>
+            </w:pPr>
+            <w:r>
+              <w:rPr>
+                <w:rFonts w:ascii="Times New Roman" w:hAnsi="Times New Roman" w:cs="Times New Roman"/>
+                <w:color w:val="000000"/>
+                <w:szCs w:val="24"/>
+              </w:rPr>
+              <w:t>Soil</w:t>
+            </w:r>
+          </w:p>
+          <w:p>
+            <w:pPr>
+              <w:jc w:val="center"/>
+              <w:rPr>
+                <w:rFonts w:ascii="Times New Roman" w:hAnsi="Times New Roman" w:cs="Times New Roman"/>
+                <w:color w:val="000000"/>
+                <w:szCs w:val="24"/>
+              </w:rPr>
+            </w:pPr>
+            <w:r>
+              <w:rPr>
+                <w:rFonts w:ascii="Times New Roman" w:hAnsi="Times New Roman" w:cs="Times New Roman"/>
+                <w:color w:val="000000"/>
+                <w:szCs w:val="24"/>
+              </w:rPr>
+              <w:t>Cavity</w:t>
+            </w:r>
+          </w:p>
+          <w:p>
+            <w:pPr>
+              <w:jc w:val="center"/>
+              <w:rPr>
+                <w:rFonts w:ascii="Times New Roman" w:hAnsi="Times New Roman" w:cs="Times New Roman"/>
+                <w:color w:val="000000"/>
+                <w:szCs w:val="24"/>
+              </w:rPr>
+            </w:pPr>
+            <w:r>
+              <w:rPr>
+                <w:rFonts w:ascii="Times New Roman" w:hAnsi="Times New Roman" w:cs="Times New Roman"/>
+                <w:color w:val="000000"/>
+                <w:szCs w:val="24"/>
+              </w:rPr>
+              <w:t>Hive</w:t>
+            </w:r>
+          </w:p>
+          <w:p>
+            <w:pPr>
+              <w:jc w:val="center"/>
+              <w:rPr>
+                <w:rFonts w:ascii="Times New Roman" w:hAnsi="Times New Roman" w:cs="Times New Roman"/>
+                <w:color w:val="000000"/>
+                <w:szCs w:val="24"/>
+              </w:rPr>
+            </w:pPr>
+            <w:r>
+              <w:rPr>
+                <w:rFonts w:ascii="Times New Roman" w:hAnsi="Times New Roman" w:cs="Times New Roman"/>
+                <w:color w:val="000000"/>
+                <w:szCs w:val="24"/>
+              </w:rPr>
+              <w:t>Pithy Stem</w:t>
+            </w:r>
+          </w:p>
+          <w:p>
+            <w:pPr>
+              <w:jc w:val="center"/>
+              <w:rPr>
+                <w:rFonts w:ascii="Times New Roman" w:hAnsi="Times New Roman" w:cs="Times New Roman"/>
+                <w:color w:val="000000"/>
+                <w:szCs w:val="24"/>
+              </w:rPr>
+            </w:pPr>
+            <w:r>
+              <w:rPr>
+                <w:rFonts w:ascii="Times New Roman" w:hAnsi="Times New Roman" w:cs="Times New Roman"/>
+                <w:color w:val="000000"/>
+                <w:szCs w:val="24"/>
+              </w:rPr>
+              <w:t>Wood</w:t>
+            </w:r>
+          </w:p>
+          <w:p>
+            <w:pPr>
+              <w:jc w:val="center"/>
+              <w:rPr>
+                <w:rFonts w:ascii="Times New Roman" w:hAnsi="Times New Roman" w:cs="Times New Roman"/>
+                <w:color w:val="000000"/>
+                <w:szCs w:val="24"/>
+              </w:rPr>
+            </w:pPr>
+            <w:proofErr w:type="spellStart"/>
+            <w:r>
+              <w:rPr>
+                <w:rFonts w:ascii="Times New Roman" w:hAnsi="Times New Roman" w:cs="Times New Roman"/>
+                <w:color w:val="000000"/>
+                <w:szCs w:val="24"/>
+              </w:rPr>
+              <w:t>Subsocial</w:t>
+            </w:r>
+            <w:proofErr w:type="spellEnd"/>
+          </w:p>
+          <w:p>
+            <w:pPr>
+              <w:jc w:val="center"/>
+              <w:rPr>
+                <w:rFonts w:ascii="Times New Roman" w:hAnsi="Times New Roman" w:cs="Times New Roman"/>
+                <w:color w:val="000000"/>
+                <w:szCs w:val="24"/>
+              </w:rPr>
+            </w:pPr>
+            <w:r>
+              <w:rPr>
+                <w:rFonts w:ascii="Times New Roman" w:hAnsi="Times New Roman" w:cs="Times New Roman"/>
+                <w:color w:val="000000"/>
+                <w:szCs w:val="24"/>
+              </w:rPr>
+              <w:t>Solitary</w:t>
+            </w:r>
+          </w:p>
+          <w:p>
+            <w:pPr>
+              <w:jc w:val="center"/>
+              <w:rPr>
+                <w:rFonts w:ascii="Times New Roman" w:hAnsi="Times New Roman" w:cs="Times New Roman"/>
+                <w:color w:val="000000"/>
+                <w:szCs w:val="24"/>
+              </w:rPr>
+            </w:pPr>
+            <w:r>
+              <w:rPr>
+                <w:rFonts w:ascii="Times New Roman" w:hAnsi="Times New Roman" w:cs="Times New Roman"/>
+                <w:color w:val="000000"/>
+                <w:szCs w:val="24"/>
+              </w:rPr>
+              <w:t>Eusocial</w:t>
+            </w:r>
+          </w:p>
+          <w:p>
+            <w:pPr>
+              <w:jc w:val="center"/>
+              <w:rPr>
+                <w:rFonts w:ascii="Times New Roman" w:hAnsi="Times New Roman" w:cs="Times New Roman"/>
+                <w:color w:val="000000"/>
+                <w:szCs w:val="24"/>
+              </w:rPr>
+            </w:pPr>
+            <w:r>
+              <w:rPr>
+                <w:rFonts w:ascii="Times New Roman" w:hAnsi="Times New Roman" w:cs="Times New Roman"/>
+                <w:color w:val="000000"/>
+                <w:szCs w:val="24"/>
+              </w:rPr>
+              <w:t>Parasitic</w:t>
+            </w:r>
+          </w:p>
+          <w:p>
+            <w:pPr>
+              <w:jc w:val="center"/>
+              <w:rPr>
+                <w:rFonts w:ascii="Times New Roman" w:hAnsi="Times New Roman" w:cs="Times New Roman"/>
+                <w:color w:val="000000"/>
+                <w:szCs w:val="24"/>
+              </w:rPr>
+            </w:pPr>
+            <w:r>
+              <w:rPr>
+                <w:rFonts w:ascii="Times New Roman" w:hAnsi="Times New Roman" w:cs="Times New Roman"/>
+                <w:color w:val="000000"/>
+                <w:szCs w:val="24"/>
+              </w:rPr>
+              <w:t>Native</w:t>
+            </w:r>
+          </w:p>
+          <w:p>
+            <w:pPr>
+              <w:jc w:val="center"/>
+              <w:rPr>
+                <w:rFonts w:ascii="Times New Roman" w:hAnsi="Times New Roman" w:cs="Times New Roman"/>
+                <w:color w:val="000000"/>
+                <w:szCs w:val="24"/>
+              </w:rPr>
+            </w:pPr>
+            <w:r>
+              <w:rPr>
+                <w:rFonts w:ascii="Times New Roman" w:hAnsi="Times New Roman" w:cs="Times New Roman"/>
+                <w:color w:val="000000"/>
+                <w:szCs w:val="24"/>
+              </w:rPr>
+              <w:t>Non-native</w:t>
+            </w:r>
+          </w:p>
+        </w:tc>
+        <w:tc>
+          <w:tcPr>
+            <w:tcW w:w="579" w:type="pct"/>
+            <w:tcBorders>
+              <w:left w:val="nil"/>
+              <w:bottom w:val="single" w:sz="4" w:space="0" w:color="auto"/>
+              <w:right w:val="nil"/>
+            </w:tcBorders>
+          </w:tcPr>
+          <w:p>
+            <w:pPr>
+              <w:jc w:val="center"/>
+              <w:rPr>
+                <w:rFonts w:ascii="Times New Roman" w:hAnsi="Times New Roman" w:cs="Times New Roman"/>
+                <w:color w:val="000000"/>
+                <w:szCs w:val="24"/>
+              </w:rPr>
+            </w:pPr>
+            <w:r>
+              <w:rPr>
+                <w:rFonts w:ascii="Times New Roman" w:hAnsi="Times New Roman" w:cs="Times New Roman"/>
+                <w:color w:val="000000"/>
+                <w:szCs w:val="24"/>
+              </w:rPr>
+              <w:t>0.164</w:t>
+            </w:r>
+          </w:p>
+          <w:p>
+            <w:pPr>
+              <w:jc w:val="center"/>
+              <w:rPr>
+                <w:rFonts w:ascii="Times New Roman" w:hAnsi="Times New Roman" w:cs="Times New Roman"/>
+                <w:color w:val="000000"/>
+                <w:szCs w:val="24"/>
+              </w:rPr>
+            </w:pPr>
+            <w:r>
+              <w:rPr>
+                <w:rFonts w:ascii="Times New Roman" w:hAnsi="Times New Roman" w:cs="Times New Roman"/>
+                <w:color w:val="000000"/>
+                <w:szCs w:val="24"/>
+              </w:rPr>
+              <w:t>-1.926</w:t>
+            </w:r>
+          </w:p>
+          <w:p>
+            <w:pPr>
+              <w:jc w:val="center"/>
+              <w:rPr>
+                <w:rFonts w:ascii="Times New Roman" w:hAnsi="Times New Roman" w:cs="Times New Roman"/>
+                <w:color w:val="000000"/>
+                <w:szCs w:val="24"/>
+              </w:rPr>
+            </w:pPr>
+            <w:r>
+              <w:rPr>
+                <w:rFonts w:ascii="Times New Roman" w:hAnsi="Times New Roman" w:cs="Times New Roman"/>
+                <w:color w:val="000000"/>
+                <w:szCs w:val="24"/>
+              </w:rPr>
+              <w:t>2.389</w:t>
+            </w:r>
+          </w:p>
+          <w:p>
+            <w:pPr>
+              <w:jc w:val="center"/>
+              <w:rPr>
+                <w:rFonts w:ascii="Times New Roman" w:hAnsi="Times New Roman" w:cs="Times New Roman"/>
+                <w:color w:val="000000"/>
+                <w:szCs w:val="24"/>
+              </w:rPr>
+            </w:pPr>
+            <w:r>
+              <w:rPr>
+                <w:rFonts w:ascii="Times New Roman" w:hAnsi="Times New Roman" w:cs="Times New Roman"/>
+                <w:color w:val="000000"/>
+                <w:szCs w:val="24"/>
+              </w:rPr>
+              <w:t>-1.230</w:t>
+            </w:r>
+          </w:p>
+          <w:p>
+            <w:pPr>
+              <w:jc w:val="center"/>
+              <w:rPr>
+                <w:rFonts w:ascii="Times New Roman" w:hAnsi="Times New Roman" w:cs="Times New Roman"/>
+                <w:color w:val="000000"/>
+                <w:szCs w:val="24"/>
+              </w:rPr>
+            </w:pPr>
+            <w:r>
+              <w:rPr>
+                <w:rFonts w:ascii="Times New Roman" w:hAnsi="Times New Roman" w:cs="Times New Roman"/>
+                <w:color w:val="000000"/>
+                <w:szCs w:val="24"/>
+              </w:rPr>
+              <w:t>-0.235</w:t>
+            </w:r>
+          </w:p>
+          <w:p>
+            <w:pPr>
+              <w:jc w:val="center"/>
+              <w:rPr>
+                <w:rFonts w:ascii="Times New Roman" w:hAnsi="Times New Roman" w:cs="Times New Roman"/>
+                <w:color w:val="000000"/>
+                <w:szCs w:val="24"/>
+              </w:rPr>
+            </w:pPr>
+            <w:r>
+              <w:rPr>
+                <w:rFonts w:ascii="Times New Roman" w:hAnsi="Times New Roman" w:cs="Times New Roman"/>
+                <w:color w:val="000000"/>
+                <w:szCs w:val="24"/>
+              </w:rPr>
+              <w:t>-0.353</w:t>
+            </w:r>
+          </w:p>
+          <w:p>
+            <w:pPr>
+              <w:jc w:val="center"/>
+              <w:rPr>
+                <w:rFonts w:ascii="Times New Roman" w:hAnsi="Times New Roman" w:cs="Times New Roman"/>
+                <w:color w:val="000000"/>
+                <w:szCs w:val="24"/>
+              </w:rPr>
+            </w:pPr>
+            <w:r>
+              <w:rPr>
+                <w:rFonts w:ascii="Times New Roman" w:hAnsi="Times New Roman" w:cs="Times New Roman"/>
+                <w:color w:val="000000"/>
+                <w:szCs w:val="24"/>
+              </w:rPr>
+              <w:t>1.601</w:t>
+            </w:r>
+          </w:p>
+          <w:p>
+            <w:pPr>
+              <w:jc w:val="center"/>
+              <w:rPr>
+                <w:rFonts w:ascii="Times New Roman" w:hAnsi="Times New Roman" w:cs="Times New Roman"/>
+                <w:color w:val="000000"/>
+                <w:szCs w:val="24"/>
+              </w:rPr>
+            </w:pPr>
+            <w:r>
+              <w:rPr>
+                <w:rFonts w:ascii="Times New Roman" w:hAnsi="Times New Roman" w:cs="Times New Roman"/>
+                <w:color w:val="000000"/>
+                <w:szCs w:val="24"/>
+              </w:rPr>
+              <w:t>-0.020</w:t>
+            </w:r>
+          </w:p>
+          <w:p>
+            <w:pPr>
+              <w:jc w:val="center"/>
+              <w:rPr>
+                <w:rFonts w:ascii="Times New Roman" w:hAnsi="Times New Roman" w:cs="Times New Roman"/>
+                <w:color w:val="000000"/>
+                <w:szCs w:val="24"/>
+              </w:rPr>
+            </w:pPr>
+            <w:r>
+              <w:rPr>
+                <w:rFonts w:ascii="Times New Roman" w:hAnsi="Times New Roman" w:cs="Times New Roman"/>
+                <w:color w:val="000000"/>
+                <w:szCs w:val="24"/>
+              </w:rPr>
+              <w:t>0.225</w:t>
+            </w:r>
+          </w:p>
+          <w:p>
+            <w:pPr>
+              <w:jc w:val="center"/>
+              <w:rPr>
+                <w:rFonts w:ascii="Times New Roman" w:hAnsi="Times New Roman" w:cs="Times New Roman"/>
+                <w:color w:val="000000"/>
+                <w:szCs w:val="24"/>
+              </w:rPr>
+            </w:pPr>
+            <w:r>
+              <w:rPr>
+                <w:rFonts w:ascii="Times New Roman" w:hAnsi="Times New Roman" w:cs="Times New Roman"/>
+                <w:color w:val="000000"/>
+                <w:szCs w:val="24"/>
+              </w:rPr>
+              <w:t>1.577</w:t>
+            </w:r>
+          </w:p>
+          <w:p>
+            <w:pPr>
+              <w:jc w:val="center"/>
+              <w:rPr>
+                <w:rFonts w:ascii="Times New Roman" w:hAnsi="Times New Roman" w:cs="Times New Roman"/>
+                <w:color w:val="000000"/>
+                <w:szCs w:val="24"/>
+              </w:rPr>
+            </w:pPr>
+            <w:r>
+              <w:rPr>
+                <w:rFonts w:ascii="Times New Roman" w:hAnsi="Times New Roman" w:cs="Times New Roman"/>
+                <w:color w:val="000000"/>
+                <w:szCs w:val="24"/>
+              </w:rPr>
+              <w:t>-0.736</w:t>
+            </w:r>
+          </w:p>
+          <w:p>
+            <w:pPr>
+              <w:jc w:val="center"/>
+              <w:rPr>
+                <w:rFonts w:ascii="Times New Roman" w:hAnsi="Times New Roman" w:cs="Times New Roman"/>
+                <w:color w:val="000000"/>
+                <w:szCs w:val="24"/>
+              </w:rPr>
+            </w:pPr>
+            <w:r>
+              <w:rPr>
+                <w:rFonts w:ascii="Times New Roman" w:hAnsi="Times New Roman" w:cs="Times New Roman"/>
+                <w:color w:val="000000"/>
+                <w:szCs w:val="24"/>
+              </w:rPr>
+              <w:t>1.557</w:t>
+            </w:r>
+          </w:p>
+          <w:p>
+            <w:pPr>
+              <w:jc w:val="center"/>
+              <w:rPr>
+                <w:rFonts w:ascii="Times New Roman" w:hAnsi="Times New Roman" w:cs="Times New Roman"/>
+                <w:color w:val="000000"/>
+                <w:szCs w:val="24"/>
+              </w:rPr>
+            </w:pPr>
+            <w:r>
+              <w:rPr>
+                <w:rFonts w:ascii="Times New Roman" w:hAnsi="Times New Roman" w:cs="Times New Roman"/>
+                <w:color w:val="000000"/>
+                <w:szCs w:val="24"/>
+              </w:rPr>
+              <w:t>-2.088</w:t>
+            </w:r>
+          </w:p>
+          <w:p>
+            <w:pPr>
+              <w:jc w:val="center"/>
+              <w:rPr>
+                <w:rFonts w:ascii="Times New Roman" w:hAnsi="Times New Roman" w:cs="Times New Roman"/>
+                <w:color w:val="000000"/>
+                <w:szCs w:val="24"/>
+              </w:rPr>
+            </w:pPr>
+            <w:r>
+              <w:rPr>
+                <w:rFonts w:ascii="Times New Roman" w:hAnsi="Times New Roman" w:cs="Times New Roman"/>
+                <w:color w:val="000000"/>
+                <w:szCs w:val="24"/>
+              </w:rPr>
+              <w:t>-1.179</w:t>
+            </w:r>
+          </w:p>
+          <w:p>
+            <w:pPr>
+              <w:jc w:val="center"/>
+              <w:rPr>
+                <w:rFonts w:ascii="Times New Roman" w:hAnsi="Times New Roman" w:cs="Times New Roman"/>
+                <w:color w:val="000000"/>
+                <w:szCs w:val="24"/>
+              </w:rPr>
+            </w:pPr>
+            <w:r>
+              <w:rPr>
+                <w:rFonts w:ascii="Times New Roman" w:hAnsi="Times New Roman" w:cs="Times New Roman"/>
+                <w:color w:val="000000"/>
+                <w:szCs w:val="24"/>
+              </w:rPr>
+              <w:t>1.179</w:t>
+            </w:r>
+          </w:p>
+        </w:tc>
+        <w:tc>
+          <w:tcPr>
+            <w:tcW w:w="579" w:type="pct"/>
+            <w:tcBorders>
+              <w:left w:val="nil"/>
+              <w:bottom w:val="single" w:sz="4" w:space="0" w:color="auto"/>
+              <w:right w:val="nil"/>
+            </w:tcBorders>
+          </w:tcPr>
+          <w:p>
+            <w:pPr>
+              <w:jc w:val="center"/>
+              <w:rPr>
+                <w:rFonts w:ascii="Times New Roman" w:hAnsi="Times New Roman" w:cs="Times New Roman"/>
+                <w:color w:val="000000"/>
+                <w:szCs w:val="24"/>
+              </w:rPr>
+            </w:pPr>
+            <w:r>
+              <w:rPr>
+                <w:rFonts w:ascii="Times New Roman" w:hAnsi="Times New Roman" w:cs="Times New Roman"/>
+                <w:color w:val="000000"/>
+                <w:szCs w:val="24"/>
+              </w:rPr>
+              <w:t>0.</w:t>
+            </w:r>
+            <w:r>
+              <w:rPr>
+                <w:rFonts w:ascii="Times New Roman" w:hAnsi="Times New Roman" w:cs="Times New Roman"/>
+                <w:color w:val="000000"/>
+                <w:szCs w:val="24"/>
+              </w:rPr>
+              <w:t>7</w:t>
+            </w:r>
+            <w:r>
+              <w:rPr>
+                <w:rFonts w:ascii="Times New Roman" w:hAnsi="Times New Roman" w:cs="Times New Roman"/>
+                <w:color w:val="000000"/>
+                <w:szCs w:val="24"/>
+              </w:rPr>
+              <w:t>4</w:t>
+            </w:r>
+            <w:r>
+              <w:rPr>
+                <w:rFonts w:ascii="Times New Roman" w:hAnsi="Times New Roman" w:cs="Times New Roman"/>
+                <w:color w:val="000000"/>
+                <w:szCs w:val="24"/>
+              </w:rPr>
+              <w:t>2</w:t>
+            </w:r>
+          </w:p>
+          <w:p>
+            <w:pPr>
+              <w:jc w:val="center"/>
+              <w:rPr>
+                <w:rFonts w:ascii="Times New Roman" w:hAnsi="Times New Roman" w:cs="Times New Roman"/>
+                <w:b/>
+                <w:bCs/>
+                <w:color w:val="000000"/>
+                <w:szCs w:val="24"/>
+              </w:rPr>
+            </w:pPr>
+            <w:r>
+              <w:rPr>
+                <w:rFonts w:ascii="Times New Roman" w:hAnsi="Times New Roman" w:cs="Times New Roman"/>
+                <w:b/>
+                <w:bCs/>
+                <w:color w:val="000000"/>
+                <w:szCs w:val="24"/>
+              </w:rPr>
+              <w:t>&lt; 0.001</w:t>
+            </w:r>
+          </w:p>
+          <w:p>
+            <w:pPr>
+              <w:jc w:val="center"/>
+              <w:rPr>
+                <w:rFonts w:ascii="Times New Roman" w:hAnsi="Times New Roman" w:cs="Times New Roman"/>
+                <w:b/>
+                <w:bCs/>
+                <w:color w:val="000000"/>
+                <w:szCs w:val="24"/>
+              </w:rPr>
+            </w:pPr>
+            <w:r>
+              <w:rPr>
+                <w:rFonts w:ascii="Times New Roman" w:hAnsi="Times New Roman" w:cs="Times New Roman"/>
+                <w:b/>
+                <w:bCs/>
+                <w:color w:val="000000"/>
+                <w:szCs w:val="24"/>
+              </w:rPr>
+              <w:t>&lt; 0.001</w:t>
+            </w:r>
+          </w:p>
+          <w:p>
+            <w:pPr>
+              <w:jc w:val="center"/>
+              <w:rPr>
+                <w:rFonts w:ascii="Times New Roman" w:hAnsi="Times New Roman" w:cs="Times New Roman"/>
+                <w:b/>
+                <w:bCs/>
+                <w:color w:val="000000"/>
+                <w:szCs w:val="24"/>
+              </w:rPr>
+            </w:pPr>
+            <w:r>
+              <w:rPr>
+                <w:rFonts w:ascii="Times New Roman" w:hAnsi="Times New Roman" w:cs="Times New Roman"/>
+                <w:b/>
+                <w:bCs/>
+                <w:color w:val="000000"/>
+                <w:szCs w:val="24"/>
+              </w:rPr>
+              <w:t>&lt; 0.001</w:t>
+            </w:r>
+          </w:p>
+          <w:p>
+            <w:pPr>
+              <w:jc w:val="center"/>
+              <w:rPr>
+                <w:rFonts w:ascii="Times New Roman" w:hAnsi="Times New Roman" w:cs="Times New Roman"/>
+                <w:color w:val="000000"/>
+                <w:szCs w:val="24"/>
+              </w:rPr>
+            </w:pPr>
+            <w:r>
+              <w:rPr>
+                <w:rFonts w:ascii="Times New Roman" w:hAnsi="Times New Roman" w:cs="Times New Roman"/>
+                <w:color w:val="000000"/>
+                <w:szCs w:val="24"/>
+              </w:rPr>
+              <w:t>0.263</w:t>
+            </w:r>
+          </w:p>
+          <w:p>
+            <w:pPr>
+              <w:jc w:val="center"/>
+              <w:rPr>
+                <w:rFonts w:ascii="Times New Roman" w:hAnsi="Times New Roman" w:cs="Times New Roman"/>
+                <w:color w:val="000000"/>
+                <w:szCs w:val="24"/>
+              </w:rPr>
+            </w:pPr>
+            <w:r>
+              <w:rPr>
+                <w:rFonts w:ascii="Times New Roman" w:hAnsi="Times New Roman" w:cs="Times New Roman"/>
+                <w:color w:val="000000"/>
+                <w:szCs w:val="24"/>
+              </w:rPr>
+              <w:t>0.089</w:t>
+            </w:r>
+          </w:p>
+          <w:p>
+            <w:pPr>
+              <w:jc w:val="center"/>
+              <w:rPr>
+                <w:rFonts w:ascii="Times New Roman" w:hAnsi="Times New Roman" w:cs="Times New Roman"/>
+                <w:b/>
+                <w:bCs/>
+                <w:color w:val="000000"/>
+                <w:szCs w:val="24"/>
+              </w:rPr>
+            </w:pPr>
+            <w:r>
+              <w:rPr>
+                <w:rFonts w:ascii="Times New Roman" w:hAnsi="Times New Roman" w:cs="Times New Roman"/>
+                <w:b/>
+                <w:bCs/>
+                <w:color w:val="000000"/>
+                <w:szCs w:val="24"/>
+              </w:rPr>
+              <w:t>0.001</w:t>
+            </w:r>
+          </w:p>
+          <w:p>
+            <w:pPr>
+              <w:jc w:val="center"/>
+              <w:rPr>
+                <w:rFonts w:ascii="Times New Roman" w:hAnsi="Times New Roman" w:cs="Times New Roman"/>
+                <w:color w:val="000000"/>
+                <w:szCs w:val="24"/>
+              </w:rPr>
+            </w:pPr>
+            <w:r>
+              <w:rPr>
+                <w:rFonts w:ascii="Times New Roman" w:hAnsi="Times New Roman" w:cs="Times New Roman"/>
+                <w:color w:val="000000"/>
+                <w:szCs w:val="24"/>
+              </w:rPr>
+              <w:t>0.89</w:t>
+            </w:r>
+          </w:p>
+          <w:p>
+            <w:pPr>
+              <w:jc w:val="center"/>
+              <w:rPr>
+                <w:rFonts w:ascii="Times New Roman" w:hAnsi="Times New Roman" w:cs="Times New Roman"/>
+                <w:color w:val="000000"/>
+                <w:szCs w:val="24"/>
+              </w:rPr>
+            </w:pPr>
+            <w:r>
+              <w:rPr>
+                <w:rFonts w:ascii="Times New Roman" w:hAnsi="Times New Roman" w:cs="Times New Roman"/>
+                <w:color w:val="000000"/>
+                <w:szCs w:val="24"/>
+              </w:rPr>
+              <w:t>0.207</w:t>
+            </w:r>
+          </w:p>
+          <w:p>
+            <w:pPr>
+              <w:jc w:val="center"/>
+              <w:rPr>
+                <w:rFonts w:ascii="Times New Roman" w:hAnsi="Times New Roman" w:cs="Times New Roman"/>
+                <w:b/>
+                <w:bCs/>
+                <w:color w:val="000000"/>
+                <w:szCs w:val="24"/>
+              </w:rPr>
+            </w:pPr>
+            <w:r>
+              <w:rPr>
+                <w:rFonts w:ascii="Times New Roman" w:hAnsi="Times New Roman" w:cs="Times New Roman"/>
+                <w:b/>
+                <w:bCs/>
+                <w:color w:val="000000"/>
+                <w:szCs w:val="24"/>
+              </w:rPr>
+              <w:t>&lt;0.001</w:t>
+            </w:r>
+          </w:p>
+          <w:p>
+            <w:pPr>
+              <w:jc w:val="center"/>
+              <w:rPr>
+                <w:rFonts w:ascii="Times New Roman" w:hAnsi="Times New Roman" w:cs="Times New Roman"/>
+                <w:b/>
+                <w:bCs/>
+                <w:color w:val="000000"/>
+                <w:szCs w:val="24"/>
+              </w:rPr>
+            </w:pPr>
+            <w:r>
+              <w:rPr>
+                <w:rFonts w:ascii="Times New Roman" w:hAnsi="Times New Roman" w:cs="Times New Roman"/>
+                <w:b/>
+                <w:bCs/>
+                <w:color w:val="000000"/>
+                <w:szCs w:val="24"/>
+              </w:rPr>
+              <w:t>0.003</w:t>
+            </w:r>
+          </w:p>
+          <w:p>
+            <w:pPr>
+              <w:jc w:val="center"/>
+              <w:rPr>
+                <w:rFonts w:ascii="Times New Roman" w:hAnsi="Times New Roman" w:cs="Times New Roman"/>
+                <w:b/>
+                <w:bCs/>
+                <w:color w:val="000000"/>
+                <w:szCs w:val="24"/>
+              </w:rPr>
+            </w:pPr>
+            <w:r>
+              <w:rPr>
+                <w:rFonts w:ascii="Times New Roman" w:hAnsi="Times New Roman" w:cs="Times New Roman"/>
+                <w:b/>
+                <w:bCs/>
+                <w:color w:val="000000"/>
+                <w:szCs w:val="24"/>
+              </w:rPr>
+              <w:t>&lt;0.001</w:t>
+            </w:r>
+          </w:p>
+          <w:p>
+            <w:pPr>
+              <w:jc w:val="center"/>
+              <w:rPr>
+                <w:rFonts w:ascii="Times New Roman" w:hAnsi="Times New Roman" w:cs="Times New Roman"/>
+                <w:b/>
+                <w:bCs/>
+                <w:color w:val="000000"/>
+                <w:szCs w:val="24"/>
+              </w:rPr>
+            </w:pPr>
+            <w:r>
+              <w:rPr>
+                <w:rFonts w:ascii="Times New Roman" w:hAnsi="Times New Roman" w:cs="Times New Roman"/>
+                <w:b/>
+                <w:bCs/>
+                <w:color w:val="000000"/>
+                <w:szCs w:val="24"/>
+              </w:rPr>
+              <w:t>&lt;0.001</w:t>
+            </w:r>
+          </w:p>
+          <w:p>
+            <w:pPr>
+              <w:jc w:val="center"/>
+              <w:rPr>
+                <w:rFonts w:ascii="Times New Roman" w:hAnsi="Times New Roman" w:cs="Times New Roman"/>
+                <w:b/>
+                <w:bCs/>
+                <w:color w:val="000000"/>
+                <w:szCs w:val="24"/>
+              </w:rPr>
+            </w:pPr>
+            <w:r>
+              <w:rPr>
+                <w:rFonts w:ascii="Times New Roman" w:hAnsi="Times New Roman" w:cs="Times New Roman"/>
+                <w:b/>
+                <w:bCs/>
+                <w:color w:val="000000"/>
+                <w:szCs w:val="24"/>
+              </w:rPr>
+              <w:t>0.001</w:t>
+            </w:r>
+          </w:p>
+          <w:p>
+            <w:pPr>
+              <w:jc w:val="center"/>
+              <w:rPr>
+                <w:rFonts w:ascii="Times New Roman" w:hAnsi="Times New Roman" w:cs="Times New Roman"/>
+                <w:color w:val="000000"/>
+                <w:szCs w:val="24"/>
+              </w:rPr>
+            </w:pPr>
+            <w:r>
+              <w:rPr>
+                <w:rFonts w:ascii="Times New Roman" w:hAnsi="Times New Roman" w:cs="Times New Roman"/>
+                <w:b/>
+                <w:bCs/>
+                <w:color w:val="000000"/>
+                <w:szCs w:val="24"/>
+              </w:rPr>
+              <w:t>0.001</w:t>
+            </w:r>
+          </w:p>
+        </w:tc>
+        <w:tc>
+          <w:tcPr>
+            <w:tcW w:w="579" w:type="pct"/>
+            <w:gridSpan w:val="2"/>
+            <w:tcBorders>
+              <w:left w:val="nil"/>
+              <w:bottom w:val="single" w:sz="4" w:space="0" w:color="auto"/>
+              <w:right w:val="nil"/>
+            </w:tcBorders>
+          </w:tcPr>
+          <w:p>
+            <w:pPr>
+              <w:jc w:val="center"/>
+              <w:rPr>
+                <w:rFonts w:ascii="Times New Roman" w:hAnsi="Times New Roman" w:cs="Times New Roman"/>
+                <w:color w:val="000000"/>
+                <w:szCs w:val="24"/>
+              </w:rPr>
+            </w:pPr>
+            <w:r>
+              <w:rPr>
+                <w:rFonts w:ascii="Times New Roman" w:hAnsi="Times New Roman" w:cs="Times New Roman"/>
+                <w:color w:val="000000"/>
+                <w:szCs w:val="24"/>
+              </w:rPr>
+              <w:t>0.921</w:t>
+            </w:r>
+          </w:p>
+          <w:p>
+            <w:pPr>
+              <w:jc w:val="center"/>
+              <w:rPr>
+                <w:rFonts w:ascii="Times New Roman" w:hAnsi="Times New Roman" w:cs="Times New Roman"/>
+                <w:color w:val="000000"/>
+                <w:szCs w:val="24"/>
+              </w:rPr>
+            </w:pPr>
+            <w:r>
+              <w:rPr>
+                <w:rFonts w:ascii="Times New Roman" w:hAnsi="Times New Roman" w:cs="Times New Roman"/>
+                <w:color w:val="000000"/>
+                <w:szCs w:val="24"/>
+              </w:rPr>
+              <w:t>-1.633</w:t>
+            </w:r>
+          </w:p>
+          <w:p>
+            <w:pPr>
+              <w:jc w:val="center"/>
+              <w:rPr>
+                <w:rFonts w:ascii="Times New Roman" w:hAnsi="Times New Roman" w:cs="Times New Roman"/>
+                <w:color w:val="000000"/>
+                <w:szCs w:val="24"/>
+              </w:rPr>
+            </w:pPr>
+            <w:r>
+              <w:rPr>
+                <w:rFonts w:ascii="Times New Roman" w:hAnsi="Times New Roman" w:cs="Times New Roman"/>
+                <w:color w:val="000000"/>
+                <w:szCs w:val="24"/>
+              </w:rPr>
+              <w:t>2.289</w:t>
+            </w:r>
+          </w:p>
+          <w:p>
+            <w:pPr>
+              <w:jc w:val="center"/>
+              <w:rPr>
+                <w:rFonts w:ascii="Times New Roman" w:hAnsi="Times New Roman" w:cs="Times New Roman"/>
+                <w:color w:val="000000"/>
+                <w:szCs w:val="24"/>
+              </w:rPr>
+            </w:pPr>
+            <w:r>
+              <w:rPr>
+                <w:rFonts w:ascii="Times New Roman" w:hAnsi="Times New Roman" w:cs="Times New Roman"/>
+                <w:color w:val="000000"/>
+                <w:szCs w:val="24"/>
+              </w:rPr>
+              <w:t>-1.436</w:t>
+            </w:r>
+          </w:p>
+          <w:p>
+            <w:pPr>
+              <w:jc w:val="center"/>
+              <w:rPr>
+                <w:rFonts w:ascii="Times New Roman" w:hAnsi="Times New Roman" w:cs="Times New Roman"/>
+                <w:color w:val="000000"/>
+                <w:szCs w:val="24"/>
+              </w:rPr>
+            </w:pPr>
+            <w:r>
+              <w:rPr>
+                <w:rFonts w:ascii="Times New Roman" w:hAnsi="Times New Roman" w:cs="Times New Roman"/>
+                <w:color w:val="000000"/>
+                <w:szCs w:val="24"/>
+              </w:rPr>
+              <w:t>-1.843</w:t>
+            </w:r>
+          </w:p>
+          <w:p>
+            <w:pPr>
+              <w:jc w:val="center"/>
+              <w:rPr>
+                <w:rFonts w:ascii="Times New Roman" w:hAnsi="Times New Roman" w:cs="Times New Roman"/>
+                <w:color w:val="000000"/>
+                <w:szCs w:val="24"/>
+              </w:rPr>
+            </w:pPr>
+            <w:r>
+              <w:rPr>
+                <w:rFonts w:ascii="Times New Roman" w:hAnsi="Times New Roman" w:cs="Times New Roman"/>
+                <w:color w:val="000000"/>
+                <w:szCs w:val="24"/>
+              </w:rPr>
+              <w:t>0.232</w:t>
+            </w:r>
+          </w:p>
+          <w:p>
+            <w:pPr>
+              <w:jc w:val="center"/>
+              <w:rPr>
+                <w:rFonts w:ascii="Times New Roman" w:hAnsi="Times New Roman" w:cs="Times New Roman"/>
+                <w:color w:val="000000"/>
+                <w:szCs w:val="24"/>
+              </w:rPr>
+            </w:pPr>
+            <w:r>
+              <w:rPr>
+                <w:rFonts w:ascii="Times New Roman" w:hAnsi="Times New Roman" w:cs="Times New Roman"/>
+                <w:color w:val="000000"/>
+                <w:szCs w:val="24"/>
+              </w:rPr>
+              <w:t>3.569</w:t>
+            </w:r>
+          </w:p>
+          <w:p>
+            <w:pPr>
+              <w:jc w:val="center"/>
+              <w:rPr>
+                <w:rFonts w:ascii="Times New Roman" w:hAnsi="Times New Roman" w:cs="Times New Roman"/>
+                <w:color w:val="000000"/>
+                <w:szCs w:val="24"/>
+              </w:rPr>
+            </w:pPr>
+            <w:r>
+              <w:rPr>
+                <w:rFonts w:ascii="Times New Roman" w:hAnsi="Times New Roman" w:cs="Times New Roman"/>
+                <w:color w:val="000000"/>
+                <w:szCs w:val="24"/>
+              </w:rPr>
+              <w:t>0.608</w:t>
+            </w:r>
+          </w:p>
+          <w:p>
+            <w:pPr>
+              <w:jc w:val="center"/>
+              <w:rPr>
+                <w:rFonts w:ascii="Times New Roman" w:hAnsi="Times New Roman" w:cs="Times New Roman"/>
+                <w:color w:val="000000"/>
+                <w:szCs w:val="24"/>
+              </w:rPr>
+            </w:pPr>
+            <w:r>
+              <w:rPr>
+                <w:rFonts w:ascii="Times New Roman" w:hAnsi="Times New Roman" w:cs="Times New Roman"/>
+                <w:color w:val="000000"/>
+                <w:szCs w:val="24"/>
+              </w:rPr>
+              <w:t>-0.791</w:t>
+            </w:r>
+          </w:p>
+          <w:p>
+            <w:pPr>
+              <w:jc w:val="center"/>
+              <w:rPr>
+                <w:rFonts w:ascii="Times New Roman" w:hAnsi="Times New Roman" w:cs="Times New Roman"/>
+                <w:color w:val="000000"/>
+                <w:szCs w:val="24"/>
+              </w:rPr>
+            </w:pPr>
+            <w:r>
+              <w:rPr>
+                <w:rFonts w:ascii="Times New Roman" w:hAnsi="Times New Roman" w:cs="Times New Roman"/>
+                <w:color w:val="000000"/>
+                <w:szCs w:val="24"/>
+              </w:rPr>
+              <w:t>1.427</w:t>
+            </w:r>
+          </w:p>
+          <w:p>
+            <w:pPr>
+              <w:jc w:val="center"/>
+              <w:rPr>
+                <w:rFonts w:ascii="Times New Roman" w:hAnsi="Times New Roman" w:cs="Times New Roman"/>
+                <w:color w:val="000000"/>
+                <w:szCs w:val="24"/>
+              </w:rPr>
+            </w:pPr>
+            <w:r>
+              <w:rPr>
+                <w:rFonts w:ascii="Times New Roman" w:hAnsi="Times New Roman" w:cs="Times New Roman"/>
+                <w:color w:val="000000"/>
+                <w:szCs w:val="24"/>
+              </w:rPr>
+              <w:t>-0.774</w:t>
+            </w:r>
+          </w:p>
+          <w:p>
+            <w:pPr>
+              <w:jc w:val="center"/>
+              <w:rPr>
+                <w:rFonts w:ascii="Times New Roman" w:hAnsi="Times New Roman" w:cs="Times New Roman"/>
+                <w:color w:val="000000"/>
+                <w:szCs w:val="24"/>
+              </w:rPr>
+            </w:pPr>
+            <w:r>
+              <w:rPr>
+                <w:rFonts w:ascii="Times New Roman" w:hAnsi="Times New Roman" w:cs="Times New Roman"/>
+                <w:color w:val="000000"/>
+                <w:szCs w:val="24"/>
+              </w:rPr>
+              <w:t>1.440</w:t>
+            </w:r>
+          </w:p>
+          <w:p>
+            <w:pPr>
+              <w:jc w:val="center"/>
+              <w:rPr>
+                <w:rFonts w:ascii="Times New Roman" w:hAnsi="Times New Roman" w:cs="Times New Roman"/>
+                <w:color w:val="000000"/>
+                <w:szCs w:val="24"/>
+              </w:rPr>
+            </w:pPr>
+            <w:r>
+              <w:rPr>
+                <w:rFonts w:ascii="Times New Roman" w:hAnsi="Times New Roman" w:cs="Times New Roman"/>
+                <w:color w:val="000000"/>
+                <w:szCs w:val="24"/>
+              </w:rPr>
+              <w:t>-1.711</w:t>
+            </w:r>
+          </w:p>
+          <w:p>
+            <w:pPr>
+              <w:jc w:val="center"/>
+              <w:rPr>
+                <w:rFonts w:ascii="Times New Roman" w:hAnsi="Times New Roman" w:cs="Times New Roman"/>
+                <w:color w:val="000000"/>
+                <w:szCs w:val="24"/>
+              </w:rPr>
+            </w:pPr>
+            <w:r>
+              <w:rPr>
+                <w:rFonts w:ascii="Times New Roman" w:hAnsi="Times New Roman" w:cs="Times New Roman"/>
+                <w:color w:val="000000"/>
+                <w:szCs w:val="24"/>
+              </w:rPr>
+              <w:t>-2.079</w:t>
+            </w:r>
+          </w:p>
+          <w:p>
+            <w:pPr>
+              <w:jc w:val="center"/>
+              <w:rPr>
+                <w:rFonts w:ascii="Times New Roman" w:hAnsi="Times New Roman" w:cs="Times New Roman"/>
+                <w:color w:val="000000"/>
+                <w:szCs w:val="24"/>
+              </w:rPr>
+            </w:pPr>
+            <w:r>
+              <w:rPr>
+                <w:rFonts w:ascii="Times New Roman" w:hAnsi="Times New Roman" w:cs="Times New Roman"/>
+                <w:color w:val="000000"/>
+                <w:szCs w:val="24"/>
+              </w:rPr>
+              <w:t>2.079</w:t>
+            </w:r>
+          </w:p>
+        </w:tc>
+        <w:tc>
+          <w:tcPr>
+            <w:tcW w:w="622" w:type="pct"/>
+            <w:tcBorders>
+              <w:left w:val="nil"/>
+              <w:bottom w:val="single" w:sz="4" w:space="0" w:color="auto"/>
+              <w:right w:val="nil"/>
+            </w:tcBorders>
+          </w:tcPr>
+          <w:p>
+            <w:pPr>
+              <w:jc w:val="center"/>
+              <w:rPr>
+                <w:rFonts w:ascii="Times New Roman" w:hAnsi="Times New Roman" w:cs="Times New Roman"/>
+                <w:color w:val="000000"/>
+                <w:szCs w:val="24"/>
+              </w:rPr>
+            </w:pPr>
+            <w:r>
+              <w:rPr>
+                <w:rFonts w:ascii="Times New Roman" w:hAnsi="Times New Roman" w:cs="Times New Roman"/>
+                <w:color w:val="000000"/>
+                <w:szCs w:val="24"/>
+              </w:rPr>
+              <w:t>0.055</w:t>
+            </w:r>
+          </w:p>
+          <w:p>
+            <w:pPr>
+              <w:jc w:val="center"/>
+              <w:rPr>
+                <w:rFonts w:ascii="Times New Roman" w:hAnsi="Times New Roman" w:cs="Times New Roman"/>
+                <w:b/>
+                <w:bCs/>
+                <w:color w:val="000000"/>
+                <w:szCs w:val="24"/>
+              </w:rPr>
+            </w:pPr>
+            <w:r>
+              <w:rPr>
+                <w:rFonts w:ascii="Times New Roman" w:hAnsi="Times New Roman" w:cs="Times New Roman"/>
+                <w:b/>
+                <w:bCs/>
+                <w:color w:val="000000"/>
+                <w:szCs w:val="24"/>
+              </w:rPr>
+              <w:t>0.008</w:t>
+            </w:r>
+          </w:p>
+          <w:p>
+            <w:pPr>
+              <w:jc w:val="center"/>
+              <w:rPr>
+                <w:rFonts w:ascii="Times New Roman" w:hAnsi="Times New Roman" w:cs="Times New Roman"/>
+                <w:b/>
+                <w:bCs/>
+                <w:color w:val="000000"/>
+                <w:szCs w:val="24"/>
+              </w:rPr>
+            </w:pPr>
+            <w:r>
+              <w:rPr>
+                <w:rFonts w:ascii="Times New Roman" w:hAnsi="Times New Roman" w:cs="Times New Roman"/>
+                <w:b/>
+                <w:bCs/>
+                <w:color w:val="000000"/>
+                <w:szCs w:val="24"/>
+              </w:rPr>
+              <w:t>0.008</w:t>
+            </w:r>
+          </w:p>
+          <w:p>
+            <w:pPr>
+              <w:jc w:val="center"/>
+              <w:rPr>
+                <w:rFonts w:ascii="Times New Roman" w:hAnsi="Times New Roman" w:cs="Times New Roman"/>
+                <w:b/>
+                <w:bCs/>
+                <w:color w:val="000000"/>
+                <w:szCs w:val="24"/>
+              </w:rPr>
+            </w:pPr>
+            <w:r>
+              <w:rPr>
+                <w:rFonts w:ascii="Times New Roman" w:hAnsi="Times New Roman" w:cs="Times New Roman"/>
+                <w:b/>
+                <w:bCs/>
+                <w:color w:val="000000"/>
+                <w:szCs w:val="24"/>
+              </w:rPr>
+              <w:t>0.008</w:t>
+            </w:r>
+          </w:p>
+          <w:p>
+            <w:pPr>
+              <w:jc w:val="center"/>
+              <w:rPr>
+                <w:rFonts w:ascii="Times New Roman" w:hAnsi="Times New Roman" w:cs="Times New Roman"/>
+                <w:b/>
+                <w:bCs/>
+                <w:color w:val="000000"/>
+                <w:szCs w:val="24"/>
+              </w:rPr>
+            </w:pPr>
+            <w:r>
+              <w:rPr>
+                <w:rFonts w:ascii="Times New Roman" w:hAnsi="Times New Roman" w:cs="Times New Roman"/>
+                <w:b/>
+                <w:bCs/>
+                <w:color w:val="000000"/>
+                <w:szCs w:val="24"/>
+              </w:rPr>
+              <w:t>0.008</w:t>
+            </w:r>
+          </w:p>
+          <w:p>
+            <w:pPr>
+              <w:jc w:val="center"/>
+              <w:rPr>
+                <w:rFonts w:ascii="Times New Roman" w:hAnsi="Times New Roman" w:cs="Times New Roman"/>
+                <w:color w:val="000000"/>
+                <w:szCs w:val="24"/>
+              </w:rPr>
+            </w:pPr>
+            <w:r>
+              <w:rPr>
+                <w:rFonts w:ascii="Times New Roman" w:hAnsi="Times New Roman" w:cs="Times New Roman"/>
+                <w:color w:val="000000"/>
+                <w:szCs w:val="24"/>
+              </w:rPr>
+              <w:t>0.844</w:t>
+            </w:r>
+          </w:p>
+          <w:p>
+            <w:pPr>
+              <w:jc w:val="center"/>
+              <w:rPr>
+                <w:rFonts w:ascii="Times New Roman" w:hAnsi="Times New Roman" w:cs="Times New Roman"/>
+                <w:b/>
+                <w:bCs/>
+                <w:color w:val="000000"/>
+                <w:szCs w:val="24"/>
+              </w:rPr>
+            </w:pPr>
+            <w:r>
+              <w:rPr>
+                <w:rFonts w:ascii="Times New Roman" w:hAnsi="Times New Roman" w:cs="Times New Roman"/>
+                <w:b/>
+                <w:bCs/>
+                <w:color w:val="000000"/>
+                <w:szCs w:val="24"/>
+              </w:rPr>
+              <w:t>0.008</w:t>
+            </w:r>
+          </w:p>
+          <w:p>
+            <w:pPr>
+              <w:jc w:val="center"/>
+              <w:rPr>
+                <w:rFonts w:ascii="Times New Roman" w:hAnsi="Times New Roman" w:cs="Times New Roman"/>
+                <w:color w:val="000000"/>
+                <w:szCs w:val="24"/>
+              </w:rPr>
+            </w:pPr>
+            <w:r>
+              <w:rPr>
+                <w:rFonts w:ascii="Times New Roman" w:hAnsi="Times New Roman" w:cs="Times New Roman"/>
+                <w:color w:val="000000"/>
+                <w:szCs w:val="24"/>
+              </w:rPr>
+              <w:t>0.109</w:t>
+            </w:r>
+          </w:p>
+          <w:p>
+            <w:pPr>
+              <w:jc w:val="center"/>
+              <w:rPr>
+                <w:rFonts w:ascii="Times New Roman" w:hAnsi="Times New Roman" w:cs="Times New Roman"/>
+                <w:b/>
+                <w:bCs/>
+                <w:color w:val="000000"/>
+                <w:szCs w:val="24"/>
+              </w:rPr>
+            </w:pPr>
+            <w:r>
+              <w:rPr>
+                <w:rFonts w:ascii="Times New Roman" w:hAnsi="Times New Roman" w:cs="Times New Roman"/>
+                <w:b/>
+                <w:bCs/>
+                <w:color w:val="000000"/>
+                <w:szCs w:val="24"/>
+              </w:rPr>
+              <w:t>0.016</w:t>
+            </w:r>
+          </w:p>
+          <w:p>
+            <w:pPr>
+              <w:jc w:val="center"/>
+              <w:rPr>
+                <w:rFonts w:ascii="Times New Roman" w:hAnsi="Times New Roman" w:cs="Times New Roman"/>
+                <w:b/>
+                <w:bCs/>
+                <w:color w:val="000000"/>
+                <w:szCs w:val="24"/>
+              </w:rPr>
+            </w:pPr>
+            <w:r>
+              <w:rPr>
+                <w:rFonts w:ascii="Times New Roman" w:hAnsi="Times New Roman" w:cs="Times New Roman"/>
+                <w:b/>
+                <w:bCs/>
+                <w:color w:val="000000"/>
+                <w:szCs w:val="24"/>
+              </w:rPr>
+              <w:t>0.016</w:t>
+            </w:r>
+          </w:p>
+          <w:p>
+            <w:pPr>
+              <w:jc w:val="center"/>
+              <w:rPr>
+                <w:rFonts w:ascii="Times New Roman" w:hAnsi="Times New Roman" w:cs="Times New Roman"/>
+                <w:color w:val="000000"/>
+                <w:szCs w:val="24"/>
+              </w:rPr>
+            </w:pPr>
+            <w:r>
+              <w:rPr>
+                <w:rFonts w:ascii="Times New Roman" w:hAnsi="Times New Roman" w:cs="Times New Roman"/>
+                <w:color w:val="000000"/>
+                <w:szCs w:val="24"/>
+              </w:rPr>
+              <w:t>0.195</w:t>
+            </w:r>
+          </w:p>
+          <w:p>
+            <w:pPr>
+              <w:jc w:val="center"/>
+              <w:rPr>
+                <w:rFonts w:ascii="Times New Roman" w:hAnsi="Times New Roman" w:cs="Times New Roman"/>
+                <w:b/>
+                <w:bCs/>
+                <w:color w:val="000000"/>
+                <w:szCs w:val="24"/>
+              </w:rPr>
+            </w:pPr>
+            <w:r>
+              <w:rPr>
+                <w:rFonts w:ascii="Times New Roman" w:hAnsi="Times New Roman" w:cs="Times New Roman"/>
+                <w:b/>
+                <w:bCs/>
+                <w:color w:val="000000"/>
+                <w:szCs w:val="24"/>
+              </w:rPr>
+              <w:t>0.023</w:t>
+            </w:r>
+          </w:p>
+          <w:p>
+            <w:pPr>
+              <w:jc w:val="center"/>
+              <w:rPr>
+                <w:rFonts w:ascii="Times New Roman" w:hAnsi="Times New Roman" w:cs="Times New Roman"/>
+                <w:b/>
+                <w:bCs/>
+                <w:color w:val="000000"/>
+                <w:szCs w:val="24"/>
+              </w:rPr>
+            </w:pPr>
+            <w:r>
+              <w:rPr>
+                <w:rFonts w:ascii="Times New Roman" w:hAnsi="Times New Roman" w:cs="Times New Roman"/>
+                <w:b/>
+                <w:bCs/>
+                <w:color w:val="000000"/>
+                <w:szCs w:val="24"/>
+              </w:rPr>
+              <w:t>0.008</w:t>
+            </w:r>
+          </w:p>
+          <w:p>
+            <w:pPr>
+              <w:jc w:val="center"/>
+              <w:rPr>
+                <w:rFonts w:ascii="Times New Roman" w:hAnsi="Times New Roman" w:cs="Times New Roman"/>
+                <w:b/>
+                <w:bCs/>
+                <w:color w:val="000000"/>
+                <w:szCs w:val="24"/>
+              </w:rPr>
+            </w:pPr>
+            <w:r>
+              <w:rPr>
+                <w:rFonts w:ascii="Times New Roman" w:hAnsi="Times New Roman" w:cs="Times New Roman"/>
+                <w:b/>
+                <w:bCs/>
+                <w:color w:val="000000"/>
+                <w:szCs w:val="24"/>
+              </w:rPr>
+              <w:t>0.008</w:t>
+            </w:r>
+          </w:p>
+          <w:p>
+            <w:pPr>
+              <w:jc w:val="center"/>
+              <w:rPr>
+                <w:rFonts w:ascii="Times New Roman" w:hAnsi="Times New Roman" w:cs="Times New Roman"/>
+                <w:color w:val="000000"/>
+                <w:szCs w:val="24"/>
+              </w:rPr>
+            </w:pPr>
+            <w:r>
+              <w:rPr>
+                <w:rFonts w:ascii="Times New Roman" w:hAnsi="Times New Roman" w:cs="Times New Roman"/>
+                <w:b/>
+                <w:bCs/>
+                <w:color w:val="000000"/>
+                <w:szCs w:val="24"/>
+              </w:rPr>
+              <w:t>0.008</w:t>
+            </w:r>
+          </w:p>
+        </w:tc>
+      </w:tr>
+      <w:tr>
+        <w:trPr>
+          <w:trHeight w:val="165"/>
+        </w:trPr>
+        <w:tc>
+          <w:tcPr>
+            <w:tcW w:w="107" w:type="pct"/>
+            <w:tcBorders>
+              <w:left w:val="nil"/>
+              <w:bottom w:val="nil"/>
+              <w:right w:val="nil"/>
+            </w:tcBorders>
+          </w:tcPr>
+          <w:p>
+            <w:pPr>
+              <w:rPr>
+                <w:rFonts w:ascii="Times New Roman" w:hAnsi="Times New Roman" w:cs="Times New Roman"/>
+                <w:szCs w:val="24"/>
+              </w:rPr>
+            </w:pPr>
+          </w:p>
+        </w:tc>
+        <w:tc>
+          <w:tcPr>
+            <w:tcW w:w="4893" w:type="pct"/>
+            <w:gridSpan w:val="9"/>
+            <w:tcBorders>
+              <w:left w:val="nil"/>
+              <w:bottom w:val="nil"/>
+              <w:right w:val="nil"/>
+            </w:tcBorders>
+          </w:tcPr>
+          <w:p>
+            <w:pPr>
+              <w:rPr>
+                <w:rFonts w:ascii="Times New Roman" w:hAnsi="Times New Roman" w:cs="Times New Roman"/>
+                <w:szCs w:val="24"/>
+              </w:rPr>
+            </w:pPr>
+            <w:r>
+              <w:rPr>
+                <w:rFonts w:ascii="Times New Roman" w:hAnsi="Times New Roman" w:cs="Times New Roman"/>
+                <w:szCs w:val="24"/>
+              </w:rPr>
+              <w:t xml:space="preserve">Note. SES is the pseudo median SES calculated from </w:t>
+            </w:r>
+            <w:proofErr w:type="gramStart"/>
+            <w:r>
+              <w:rPr>
+                <w:rFonts w:ascii="Times New Roman" w:hAnsi="Times New Roman" w:cs="Times New Roman"/>
+                <w:szCs w:val="24"/>
+              </w:rPr>
+              <w:t>all of</w:t>
+            </w:r>
+            <w:proofErr w:type="gramEnd"/>
+            <w:r>
+              <w:rPr>
+                <w:rFonts w:ascii="Times New Roman" w:hAnsi="Times New Roman" w:cs="Times New Roman"/>
+                <w:szCs w:val="24"/>
+              </w:rPr>
+              <w:t xml:space="preserve"> the sites in Cleveland. Alpha level for significant </w:t>
+            </w:r>
+            <w:r>
+              <w:rPr>
+                <w:rFonts w:ascii="Times New Roman" w:hAnsi="Times New Roman" w:cs="Times New Roman"/>
+                <w:i/>
+                <w:iCs/>
+                <w:szCs w:val="24"/>
+              </w:rPr>
+              <w:t xml:space="preserve">p </w:t>
+            </w:r>
+            <w:r>
+              <w:rPr>
+                <w:rFonts w:ascii="Times New Roman" w:hAnsi="Times New Roman" w:cs="Times New Roman"/>
+                <w:szCs w:val="24"/>
+              </w:rPr>
+              <w:t xml:space="preserve">value set at 0.05 </w:t>
+            </w:r>
+            <w:r>
+              <w:rPr>
+                <w:rFonts w:ascii="Times New Roman" w:hAnsi="Times New Roman" w:cs="Times New Roman"/>
+                <w:i/>
+                <w:iCs/>
+                <w:szCs w:val="24"/>
+              </w:rPr>
+              <w:t xml:space="preserve">a priori. </w:t>
+            </w:r>
+            <w:r>
+              <w:rPr>
+                <w:rFonts w:ascii="Times New Roman" w:hAnsi="Times New Roman" w:cs="Times New Roman"/>
+                <w:szCs w:val="24"/>
+              </w:rPr>
+              <w:t xml:space="preserve">Significant </w:t>
+            </w:r>
+            <w:r>
+              <w:rPr>
+                <w:rFonts w:ascii="Times New Roman" w:hAnsi="Times New Roman" w:cs="Times New Roman"/>
+                <w:i/>
+                <w:iCs/>
+                <w:szCs w:val="24"/>
+              </w:rPr>
+              <w:t>p-</w:t>
+            </w:r>
+            <w:r>
+              <w:rPr>
+                <w:rFonts w:ascii="Times New Roman" w:hAnsi="Times New Roman" w:cs="Times New Roman"/>
+                <w:szCs w:val="24"/>
+              </w:rPr>
+              <w:t>values have been bolded.</w:t>
+            </w:r>
+          </w:p>
+        </w:tc>
+      </w:tr>
+    </w:tbl>
     <w:p>
       <w:pPr>
         <w:spacing w:after="0" w:line="480" w:lineRule="auto"/>
@@ -7264,7 +8752,6 @@
           <w:sz w:val="24"/>
           <w:szCs w:val="24"/>
         </w:rPr>
-        <w:lastRenderedPageBreak/>
         <w:t xml:space="preserve">Table </w:t>
       </w:r>
       <w:commentRangeEnd w:id="3"/>
@@ -7358,6 +8845,7 @@
                 <w:iCs/>
                 <w:szCs w:val="24"/>
               </w:rPr>
+              <w:lastRenderedPageBreak/>
               <w:t>Diversity Type</w:t>
             </w:r>
           </w:p>
@@ -8378,7 +9866,6 @@
           <w:sz w:val="24"/>
           <w:szCs w:val="24"/>
         </w:rPr>
-        <w:lastRenderedPageBreak/>
         <w:t xml:space="preserve">Table 6. </w:t>
       </w:r>
       <w:commentRangeEnd w:id="4"/>
@@ -8471,6 +9958,7 @@
                 <w:iCs/>
                 <w:szCs w:val="24"/>
               </w:rPr>
+              <w:lastRenderedPageBreak/>
               <w:t>Trait</w:t>
             </w:r>
           </w:p>
@@ -8915,7 +10403,6 @@
                 <w:rFonts w:ascii="Times New Roman" w:hAnsi="Times New Roman" w:cs="Times New Roman"/>
                 <w:szCs w:val="24"/>
               </w:rPr>
-              <w:lastRenderedPageBreak/>
               <w:t>Body Length</w:t>
             </w:r>
           </w:p>
@@ -9179,7 +10666,6 @@
                 <w:color w:val="000000"/>
                 <w:szCs w:val="24"/>
               </w:rPr>
-              <w:lastRenderedPageBreak/>
               <w:t>Eusocial</w:t>
             </w:r>
           </w:p>
@@ -9256,7 +10742,6 @@
                 <w:rFonts w:ascii="Times New Roman" w:hAnsi="Times New Roman" w:cs="Times New Roman"/>
                 <w:szCs w:val="24"/>
               </w:rPr>
-              <w:lastRenderedPageBreak/>
               <w:t>Intercept</w:t>
             </w:r>
           </w:p>
@@ -9605,7 +11090,6 @@
                 <w:color w:val="000000"/>
                 <w:szCs w:val="24"/>
               </w:rPr>
-              <w:lastRenderedPageBreak/>
               <w:t>Intercept</w:t>
             </w:r>
           </w:p>
@@ -9688,7 +11172,6 @@
                 <w:color w:val="000000"/>
                 <w:szCs w:val="24"/>
               </w:rPr>
-              <w:lastRenderedPageBreak/>
               <w:t>-</w:t>
             </w:r>
           </w:p>
@@ -9997,7 +11480,6 @@
                 <w:rFonts w:ascii="Times New Roman" w:hAnsi="Times New Roman" w:cs="Times New Roman"/>
                 <w:szCs w:val="24"/>
               </w:rPr>
-              <w:lastRenderedPageBreak/>
               <w:t>-</w:t>
             </w:r>
           </w:p>
@@ -10074,7 +11556,6 @@
                 <w:color w:val="000000"/>
                 <w:szCs w:val="24"/>
               </w:rPr>
-              <w:lastRenderedPageBreak/>
               <w:t>-</w:t>
             </w:r>
           </w:p>
@@ -10383,7 +11864,6 @@
                 <w:rFonts w:ascii="Times New Roman" w:hAnsi="Times New Roman" w:cs="Times New Roman"/>
                 <w:szCs w:val="24"/>
               </w:rPr>
-              <w:lastRenderedPageBreak/>
               <w:t>-</w:t>
             </w:r>
           </w:p>
@@ -10460,7 +11940,6 @@
                 <w:color w:val="000000"/>
                 <w:szCs w:val="24"/>
               </w:rPr>
-              <w:lastRenderedPageBreak/>
               <w:t>-</w:t>
             </w:r>
           </w:p>
@@ -10821,7 +12300,6 @@
                 <w:rFonts w:ascii="Times New Roman" w:hAnsi="Times New Roman" w:cs="Times New Roman"/>
                 <w:szCs w:val="24"/>
               </w:rPr>
-              <w:lastRenderedPageBreak/>
               <w:t>-</w:t>
             </w:r>
           </w:p>
@@ -10913,7 +12391,6 @@
                 <w:rFonts w:ascii="Times New Roman" w:hAnsi="Times New Roman" w:cs="Times New Roman"/>
                 <w:szCs w:val="24"/>
               </w:rPr>
-              <w:lastRenderedPageBreak/>
               <w:t xml:space="preserve">Note. Alpha level for significant </w:t>
             </w:r>
             <w:r>
@@ -11122,7 +12599,6 @@
           <w:sz w:val="24"/>
           <w:szCs w:val="24"/>
         </w:rPr>
-        <w:lastRenderedPageBreak/>
         <w:t xml:space="preserve">Figure </w:t>
       </w:r>
       <w:commentRangeEnd w:id="6"/>
@@ -11176,6 +12652,7 @@
           <w:noProof/>
           <w:szCs w:val="24"/>
         </w:rPr>
+        <w:lastRenderedPageBreak/>
         <w:drawing>
           <wp:inline distT="0" distB="0" distL="0" distR="0" wp14:anchorId="7530DF86" wp14:editId="6EFC1542">
             <wp:extent cx="5943600" cy="3086100"/>
@@ -11311,7 +12788,6 @@
           <w:sz w:val="24"/>
           <w:szCs w:val="24"/>
         </w:rPr>
-        <w:lastRenderedPageBreak/>
         <w:t xml:space="preserve">Figure 2- graph of LPI as a predictor of the SES for specialist bee species in comparison of the functional group proportion in vacant lots compared to a null based on the bees found in Cleveland. </w:t>
       </w:r>
     </w:p>
@@ -11329,6 +12805,7 @@
           <w:noProof/>
           <w:szCs w:val="24"/>
         </w:rPr>
+        <w:lastRenderedPageBreak/>
         <w:drawing>
           <wp:inline distT="0" distB="0" distL="0" distR="0" wp14:anchorId="57C86F4C" wp14:editId="3F62AD39">
             <wp:extent cx="4434921" cy="3492500"/>
@@ -11452,7 +12929,6 @@
           <w:sz w:val="24"/>
           <w:szCs w:val="24"/>
         </w:rPr>
-        <w:lastRenderedPageBreak/>
         <w:t xml:space="preserve">Figure 3- graph of </w:t>
       </w:r>
       <w:commentRangeEnd w:id="7"/>
@@ -11500,6 +12976,7 @@
         <w:rPr>
           <w:noProof/>
         </w:rPr>
+        <w:lastRenderedPageBreak/>
         <w:drawing>
           <wp:inline distT="0" distB="0" distL="0" distR="0" wp14:anchorId="479C2BCA" wp14:editId="4D48B42E">
             <wp:extent cx="5943600" cy="2540000"/>

</xml_diff>